<commit_message>
built in utility type--omit example
</commit_message>
<xml_diff>
--- a/To-Do-TypeScript.docx
+++ b/To-Do-TypeScript.docx
@@ -415,6 +415,7 @@
         <w:rPr>
           <w:rStyle w:val="Strong"/>
           <w:rFonts w:ascii="Arial" w:hAnsi="Arial" w:cs="Arial"/>
+          <w:highlight w:val="green"/>
         </w:rPr>
         <w:t>Tuples</w:t>
       </w:r>
@@ -422,8 +423,16 @@
         <w:rPr>
           <w:rStyle w:val="t286pc"/>
           <w:rFonts w:ascii="Arial" w:hAnsi="Arial" w:cs="Arial"/>
-        </w:rPr>
-        <w:t>: Fixed-length arrays with specific types at specific indexes.</w:t>
+          <w:highlight w:val="green"/>
+        </w:rPr>
+        <w:t>: Fixed-length</w:t>
+      </w:r>
+      <w:r>
+        <w:rPr>
+          <w:rStyle w:val="t286pc"/>
+          <w:rFonts w:ascii="Arial" w:hAnsi="Arial" w:cs="Arial"/>
+        </w:rPr>
+        <w:t xml:space="preserve"> arrays with specific types at specific indexes.</w:t>
       </w:r>
       <w:r>
         <w:rPr>
@@ -439,8 +448,6 @@
           <w:rFonts w:ascii="Arial" w:hAnsi="Arial" w:cs="Arial"/>
         </w:rPr>
       </w:pPr>
-      <w:bookmarkStart w:id="0" w:name="_GoBack"/>
-      <w:bookmarkEnd w:id="0"/>
     </w:p>
     <w:p>
       <w:pPr>
@@ -1446,6 +1453,1959 @@
       </w:r>
     </w:p>
     <w:p/>
+    <w:p/>
+    <w:p/>
+    <w:p/>
+    <w:p>
+      <w:r>
+        <w:t xml:space="preserve">0:00:00 </w:t>
+      </w:r>
+      <w:r>
+        <w:rPr>
+          <w:rFonts w:ascii="Nirmala UI" w:hAnsi="Nirmala UI" w:cs="Nirmala UI"/>
+        </w:rPr>
+        <w:t>কোর্স</w:t>
+      </w:r>
+      <w:r>
+        <w:t xml:space="preserve"> </w:t>
+      </w:r>
+      <w:r>
+        <w:rPr>
+          <w:rFonts w:ascii="Nirmala UI" w:hAnsi="Nirmala UI" w:cs="Nirmala UI"/>
+        </w:rPr>
+        <w:t>ইন্ট্রোডাকশন</w:t>
+      </w:r>
+      <w:r>
+        <w:t xml:space="preserve">  </w:t>
+      </w:r>
+    </w:p>
+    <w:p>
+      <w:r>
+        <w:t xml:space="preserve">0:00:15 TypeScript </w:t>
+      </w:r>
+      <w:r>
+        <w:rPr>
+          <w:rFonts w:ascii="Nirmala UI" w:hAnsi="Nirmala UI" w:cs="Nirmala UI"/>
+        </w:rPr>
+        <w:t>ইনস্টল</w:t>
+      </w:r>
+      <w:r>
+        <w:t xml:space="preserve"> </w:t>
+      </w:r>
+      <w:r>
+        <w:rPr>
+          <w:rFonts w:ascii="Nirmala UI" w:hAnsi="Nirmala UI" w:cs="Nirmala UI"/>
+        </w:rPr>
+        <w:t>করা</w:t>
+      </w:r>
+      <w:r>
+        <w:t xml:space="preserve"> </w:t>
+      </w:r>
+    </w:p>
+    <w:p>
+      <w:r>
+        <w:t xml:space="preserve">0:00:53 Code editor (VSCode) </w:t>
+      </w:r>
+      <w:r>
+        <w:rPr>
+          <w:rFonts w:ascii="Nirmala UI" w:hAnsi="Nirmala UI" w:cs="Nirmala UI"/>
+        </w:rPr>
+        <w:t>কনফিগার</w:t>
+      </w:r>
+      <w:r>
+        <w:t xml:space="preserve"> </w:t>
+      </w:r>
+      <w:r>
+        <w:rPr>
+          <w:rFonts w:ascii="Nirmala UI" w:hAnsi="Nirmala UI" w:cs="Nirmala UI"/>
+        </w:rPr>
+        <w:t>করা।</w:t>
+      </w:r>
+      <w:r>
+        <w:t xml:space="preserve"> </w:t>
+      </w:r>
+    </w:p>
+    <w:p>
+      <w:r>
+        <w:t xml:space="preserve">0:02:05 </w:t>
+      </w:r>
+      <w:r>
+        <w:rPr>
+          <w:rFonts w:ascii="Nirmala UI" w:hAnsi="Nirmala UI" w:cs="Nirmala UI"/>
+        </w:rPr>
+        <w:t>আমাদের</w:t>
+      </w:r>
+      <w:r>
+        <w:t xml:space="preserve"> </w:t>
+      </w:r>
+      <w:r>
+        <w:rPr>
+          <w:rFonts w:ascii="Nirmala UI" w:hAnsi="Nirmala UI" w:cs="Nirmala UI"/>
+        </w:rPr>
+        <w:t>প্রথম</w:t>
+      </w:r>
+      <w:r>
+        <w:t xml:space="preserve"> TypeScript </w:t>
+      </w:r>
+      <w:r>
+        <w:rPr>
+          <w:rFonts w:ascii="Nirmala UI" w:hAnsi="Nirmala UI" w:cs="Nirmala UI"/>
+        </w:rPr>
+        <w:t>কোড</w:t>
+      </w:r>
+      <w:r>
+        <w:t xml:space="preserve"> </w:t>
+      </w:r>
+      <w:r>
+        <w:rPr>
+          <w:rFonts w:ascii="Nirmala UI" w:hAnsi="Nirmala UI" w:cs="Nirmala UI"/>
+        </w:rPr>
+        <w:t>এবংটাইপস্ক্রিপ্টের</w:t>
+      </w:r>
+      <w:r>
+        <w:t xml:space="preserve"> </w:t>
+      </w:r>
+      <w:r>
+        <w:rPr>
+          <w:rFonts w:ascii="Nirmala UI" w:hAnsi="Nirmala UI" w:cs="Nirmala UI"/>
+        </w:rPr>
+        <w:t>বেসিকস।</w:t>
+      </w:r>
+    </w:p>
+    <w:p>
+      <w:r>
+        <w:t xml:space="preserve">0:06:43 String, number, boolean, undefined, any </w:t>
+      </w:r>
+      <w:r>
+        <w:rPr>
+          <w:rFonts w:ascii="Nirmala UI" w:hAnsi="Nirmala UI" w:cs="Nirmala UI"/>
+        </w:rPr>
+        <w:t>টাইপ</w:t>
+      </w:r>
+      <w:r>
+        <w:t xml:space="preserve"> </w:t>
+      </w:r>
+      <w:r>
+        <w:rPr>
+          <w:rFonts w:ascii="Nirmala UI" w:hAnsi="Nirmala UI" w:cs="Nirmala UI"/>
+        </w:rPr>
+        <w:t>নিয়ে</w:t>
+      </w:r>
+      <w:r>
+        <w:t xml:space="preserve"> </w:t>
+      </w:r>
+      <w:r>
+        <w:rPr>
+          <w:rFonts w:ascii="Nirmala UI" w:hAnsi="Nirmala UI" w:cs="Nirmala UI"/>
+        </w:rPr>
+        <w:t>একটু</w:t>
+      </w:r>
+      <w:r>
+        <w:t xml:space="preserve"> basic </w:t>
+      </w:r>
+      <w:r>
+        <w:rPr>
+          <w:rFonts w:ascii="Nirmala UI" w:hAnsi="Nirmala UI" w:cs="Nirmala UI"/>
+        </w:rPr>
+        <w:t>ধারণা</w:t>
+      </w:r>
+    </w:p>
+    <w:p>
+      <w:r>
+        <w:t xml:space="preserve">0:09:31 </w:t>
+      </w:r>
+      <w:r>
+        <w:rPr>
+          <w:rFonts w:ascii="Nirmala UI" w:hAnsi="Nirmala UI" w:cs="Nirmala UI"/>
+        </w:rPr>
+        <w:t>টার্মিনাল</w:t>
+      </w:r>
+      <w:r>
+        <w:t xml:space="preserve"> </w:t>
+      </w:r>
+      <w:r>
+        <w:rPr>
+          <w:rFonts w:ascii="Nirmala UI" w:hAnsi="Nirmala UI" w:cs="Nirmala UI"/>
+        </w:rPr>
+        <w:t>থেকে</w:t>
+      </w:r>
+      <w:r>
+        <w:t xml:space="preserve"> TypeScript </w:t>
+      </w:r>
+      <w:r>
+        <w:rPr>
+          <w:rFonts w:ascii="Nirmala UI" w:hAnsi="Nirmala UI" w:cs="Nirmala UI"/>
+        </w:rPr>
+        <w:t>এর</w:t>
+      </w:r>
+      <w:r>
+        <w:t xml:space="preserve"> </w:t>
+      </w:r>
+      <w:r>
+        <w:rPr>
+          <w:rFonts w:ascii="Nirmala UI" w:hAnsi="Nirmala UI" w:cs="Nirmala UI"/>
+        </w:rPr>
+        <w:t>কোড</w:t>
+      </w:r>
+      <w:r>
+        <w:t xml:space="preserve"> </w:t>
+      </w:r>
+      <w:r>
+        <w:rPr>
+          <w:rFonts w:ascii="Nirmala UI" w:hAnsi="Nirmala UI" w:cs="Nirmala UI"/>
+        </w:rPr>
+        <w:t>রান</w:t>
+      </w:r>
+      <w:r>
+        <w:t xml:space="preserve"> </w:t>
+      </w:r>
+      <w:r>
+        <w:rPr>
+          <w:rFonts w:ascii="Nirmala UI" w:hAnsi="Nirmala UI" w:cs="Nirmala UI"/>
+        </w:rPr>
+        <w:t>করা।</w:t>
+      </w:r>
+      <w:r>
+        <w:t xml:space="preserve"> </w:t>
+      </w:r>
+    </w:p>
+    <w:p>
+      <w:r>
+        <w:t xml:space="preserve">0:10:14 TypeScript </w:t>
+      </w:r>
+      <w:r>
+        <w:rPr>
+          <w:rFonts w:ascii="Nirmala UI" w:hAnsi="Nirmala UI" w:cs="Nirmala UI"/>
+        </w:rPr>
+        <w:t>থেকে</w:t>
+      </w:r>
+      <w:r>
+        <w:t xml:space="preserve"> JavaScript </w:t>
+      </w:r>
+      <w:r>
+        <w:rPr>
+          <w:rFonts w:ascii="Nirmala UI" w:hAnsi="Nirmala UI" w:cs="Nirmala UI"/>
+        </w:rPr>
+        <w:t>এর</w:t>
+      </w:r>
+      <w:r>
+        <w:t xml:space="preserve"> </w:t>
+      </w:r>
+      <w:r>
+        <w:rPr>
+          <w:rFonts w:ascii="Nirmala UI" w:hAnsi="Nirmala UI" w:cs="Nirmala UI"/>
+        </w:rPr>
+        <w:t>কনভার্সন</w:t>
+      </w:r>
+      <w:r>
+        <w:t xml:space="preserve"> (Transpiling) </w:t>
+      </w:r>
+      <w:r>
+        <w:rPr>
+          <w:rFonts w:ascii="Nirmala UI" w:hAnsi="Nirmala UI" w:cs="Nirmala UI"/>
+        </w:rPr>
+        <w:t>এবং</w:t>
+      </w:r>
+      <w:r>
+        <w:t xml:space="preserve"> HTML-</w:t>
+      </w:r>
+      <w:r>
+        <w:rPr>
+          <w:rFonts w:ascii="Nirmala UI" w:hAnsi="Nirmala UI" w:cs="Nirmala UI"/>
+        </w:rPr>
+        <w:t>এর</w:t>
+      </w:r>
+      <w:r>
+        <w:t xml:space="preserve"> </w:t>
+      </w:r>
+      <w:r>
+        <w:rPr>
+          <w:rFonts w:ascii="Nirmala UI" w:hAnsi="Nirmala UI" w:cs="Nirmala UI"/>
+        </w:rPr>
+        <w:t>মধ্যে</w:t>
+      </w:r>
+      <w:r>
+        <w:t xml:space="preserve"> TypeScript-</w:t>
+      </w:r>
+      <w:r>
+        <w:rPr>
+          <w:rFonts w:ascii="Nirmala UI" w:hAnsi="Nirmala UI" w:cs="Nirmala UI"/>
+        </w:rPr>
+        <w:t>এর</w:t>
+      </w:r>
+      <w:r>
+        <w:t xml:space="preserve"> </w:t>
+      </w:r>
+      <w:r>
+        <w:rPr>
+          <w:rFonts w:ascii="Nirmala UI" w:hAnsi="Nirmala UI" w:cs="Nirmala UI"/>
+        </w:rPr>
+        <w:t>ব্যবহার।</w:t>
+      </w:r>
+      <w:r>
+        <w:t xml:space="preserve"> </w:t>
+      </w:r>
+    </w:p>
+    <w:p>
+      <w:r>
+        <w:t xml:space="preserve">0:13:03 Watch Mode </w:t>
+      </w:r>
+      <w:r>
+        <w:rPr>
+          <w:rFonts w:ascii="Nirmala UI" w:hAnsi="Nirmala UI" w:cs="Nirmala UI"/>
+        </w:rPr>
+        <w:t>ব্যবহার</w:t>
+      </w:r>
+      <w:r>
+        <w:t xml:space="preserve"> </w:t>
+      </w:r>
+      <w:r>
+        <w:rPr>
+          <w:rFonts w:ascii="Nirmala UI" w:hAnsi="Nirmala UI" w:cs="Nirmala UI"/>
+        </w:rPr>
+        <w:t>করে</w:t>
+      </w:r>
+      <w:r>
+        <w:t xml:space="preserve"> </w:t>
+      </w:r>
+      <w:r>
+        <w:rPr>
+          <w:rFonts w:ascii="Nirmala UI" w:hAnsi="Nirmala UI" w:cs="Nirmala UI"/>
+        </w:rPr>
+        <w:t>অটোমেটিক্যালি</w:t>
+      </w:r>
+      <w:r>
+        <w:t xml:space="preserve"> </w:t>
+      </w:r>
+      <w:r>
+        <w:rPr>
+          <w:rFonts w:ascii="Nirmala UI" w:hAnsi="Nirmala UI" w:cs="Nirmala UI"/>
+        </w:rPr>
+        <w:t>ট্রান্সপাইল</w:t>
+      </w:r>
+      <w:r>
+        <w:t xml:space="preserve"> </w:t>
+      </w:r>
+      <w:r>
+        <w:rPr>
+          <w:rFonts w:ascii="Nirmala UI" w:hAnsi="Nirmala UI" w:cs="Nirmala UI"/>
+        </w:rPr>
+        <w:t>করা।</w:t>
+      </w:r>
+    </w:p>
+    <w:p>
+      <w:r>
+        <w:t xml:space="preserve">0:13:48 Multiple file </w:t>
+      </w:r>
+      <w:r>
+        <w:rPr>
+          <w:rFonts w:ascii="Nirmala UI" w:hAnsi="Nirmala UI" w:cs="Nirmala UI"/>
+        </w:rPr>
+        <w:t>একসাথে</w:t>
+      </w:r>
+      <w:r>
+        <w:t xml:space="preserve"> Transpile </w:t>
+      </w:r>
+      <w:r>
+        <w:rPr>
+          <w:rFonts w:ascii="Nirmala UI" w:hAnsi="Nirmala UI" w:cs="Nirmala UI"/>
+        </w:rPr>
+        <w:t>করা।</w:t>
+      </w:r>
+      <w:r>
+        <w:t xml:space="preserve"> </w:t>
+      </w:r>
+    </w:p>
+    <w:p>
+      <w:r>
+        <w:t xml:space="preserve">0:15:47 Different directory </w:t>
+      </w:r>
+      <w:r>
+        <w:rPr>
+          <w:rFonts w:ascii="Nirmala UI" w:hAnsi="Nirmala UI" w:cs="Nirmala UI"/>
+        </w:rPr>
+        <w:t>তে</w:t>
+      </w:r>
+      <w:r>
+        <w:t xml:space="preserve"> multiple file </w:t>
+      </w:r>
+      <w:r>
+        <w:rPr>
+          <w:rFonts w:ascii="Nirmala UI" w:hAnsi="Nirmala UI" w:cs="Nirmala UI"/>
+        </w:rPr>
+        <w:t>একসাথে</w:t>
+      </w:r>
+      <w:r>
+        <w:t xml:space="preserve"> transpile </w:t>
+      </w:r>
+      <w:r>
+        <w:rPr>
+          <w:rFonts w:ascii="Nirmala UI" w:hAnsi="Nirmala UI" w:cs="Nirmala UI"/>
+        </w:rPr>
+        <w:t>করা।</w:t>
+      </w:r>
+      <w:r>
+        <w:t xml:space="preserve"> </w:t>
+      </w:r>
+    </w:p>
+    <w:p>
+      <w:r>
+        <w:t>0:17:36 TypeScript-</w:t>
+      </w:r>
+      <w:r>
+        <w:rPr>
+          <w:rFonts w:ascii="Nirmala UI" w:hAnsi="Nirmala UI" w:cs="Nirmala UI"/>
+        </w:rPr>
+        <w:t>এর</w:t>
+      </w:r>
+      <w:r>
+        <w:t xml:space="preserve"> </w:t>
+      </w:r>
+      <w:r>
+        <w:rPr>
+          <w:rFonts w:ascii="Nirmala UI" w:hAnsi="Nirmala UI" w:cs="Nirmala UI"/>
+        </w:rPr>
+        <w:t>বিভিন্ন</w:t>
+      </w:r>
+      <w:r>
+        <w:t xml:space="preserve"> Type </w:t>
+      </w:r>
+      <w:r>
+        <w:rPr>
+          <w:rFonts w:ascii="Nirmala UI" w:hAnsi="Nirmala UI" w:cs="Nirmala UI"/>
+        </w:rPr>
+        <w:t>নিয়ে</w:t>
+      </w:r>
+      <w:r>
+        <w:t xml:space="preserve"> </w:t>
+      </w:r>
+      <w:r>
+        <w:rPr>
+          <w:rFonts w:ascii="Nirmala UI" w:hAnsi="Nirmala UI" w:cs="Nirmala UI"/>
+        </w:rPr>
+        <w:t>বিস্তারিত</w:t>
+      </w:r>
+      <w:r>
+        <w:t xml:space="preserve"> </w:t>
+      </w:r>
+      <w:r>
+        <w:rPr>
+          <w:rFonts w:ascii="Nirmala UI" w:hAnsi="Nirmala UI" w:cs="Nirmala UI"/>
+        </w:rPr>
+        <w:t>আলোচনা।</w:t>
+      </w:r>
+      <w:r>
+        <w:t xml:space="preserve"> </w:t>
+      </w:r>
+    </w:p>
+    <w:p>
+      <w:r>
+        <w:lastRenderedPageBreak/>
+        <w:t xml:space="preserve">0:22:49 </w:t>
+      </w:r>
+      <w:r>
+        <w:rPr>
+          <w:rFonts w:ascii="Nirmala UI" w:hAnsi="Nirmala UI" w:cs="Nirmala UI"/>
+        </w:rPr>
+        <w:t>ভ্যারিয়েবল</w:t>
+      </w:r>
+      <w:r>
+        <w:t xml:space="preserve"> </w:t>
+      </w:r>
+      <w:r>
+        <w:rPr>
+          <w:rFonts w:ascii="Nirmala UI" w:hAnsi="Nirmala UI" w:cs="Nirmala UI"/>
+        </w:rPr>
+        <w:t>এর</w:t>
+      </w:r>
+      <w:r>
+        <w:t xml:space="preserve"> </w:t>
+      </w:r>
+      <w:r>
+        <w:rPr>
+          <w:rFonts w:ascii="Nirmala UI" w:hAnsi="Nirmala UI" w:cs="Nirmala UI"/>
+        </w:rPr>
+        <w:t>নাম</w:t>
+      </w:r>
+      <w:r>
+        <w:t xml:space="preserve"> </w:t>
+      </w:r>
+      <w:r>
+        <w:rPr>
+          <w:rFonts w:ascii="Nirmala UI" w:hAnsi="Nirmala UI" w:cs="Nirmala UI"/>
+        </w:rPr>
+        <w:t>নিয়ে</w:t>
+      </w:r>
+      <w:r>
+        <w:t xml:space="preserve"> </w:t>
+      </w:r>
+      <w:r>
+        <w:rPr>
+          <w:rFonts w:ascii="Nirmala UI" w:hAnsi="Nirmala UI" w:cs="Nirmala UI"/>
+        </w:rPr>
+        <w:t>গন্ডগোল।</w:t>
+      </w:r>
+      <w:r>
+        <w:t xml:space="preserve"> </w:t>
+      </w:r>
+    </w:p>
+    <w:p>
+      <w:r>
+        <w:t xml:space="preserve">0:25:13 Array </w:t>
+      </w:r>
+      <w:r>
+        <w:rPr>
+          <w:rFonts w:ascii="Nirmala UI" w:hAnsi="Nirmala UI" w:cs="Nirmala UI"/>
+        </w:rPr>
+        <w:t>এবং</w:t>
+      </w:r>
+      <w:r>
+        <w:t xml:space="preserve"> JSON object </w:t>
+      </w:r>
+      <w:r>
+        <w:rPr>
+          <w:rFonts w:ascii="Nirmala UI" w:hAnsi="Nirmala UI" w:cs="Nirmala UI"/>
+        </w:rPr>
+        <w:t>নিয়ে</w:t>
+      </w:r>
+      <w:r>
+        <w:t xml:space="preserve"> </w:t>
+      </w:r>
+      <w:r>
+        <w:rPr>
+          <w:rFonts w:ascii="Nirmala UI" w:hAnsi="Nirmala UI" w:cs="Nirmala UI"/>
+        </w:rPr>
+        <w:t>কাজ</w:t>
+      </w:r>
+      <w:r>
+        <w:t xml:space="preserve"> </w:t>
+      </w:r>
+      <w:r>
+        <w:rPr>
+          <w:rFonts w:ascii="Nirmala UI" w:hAnsi="Nirmala UI" w:cs="Nirmala UI"/>
+        </w:rPr>
+        <w:t>করা।</w:t>
+      </w:r>
+    </w:p>
+    <w:p>
+      <w:r>
+        <w:t xml:space="preserve">0:29:42 Type </w:t>
+      </w:r>
+      <w:r>
+        <w:rPr>
+          <w:rFonts w:ascii="Nirmala UI" w:hAnsi="Nirmala UI" w:cs="Nirmala UI"/>
+        </w:rPr>
+        <w:t>এর</w:t>
+      </w:r>
+      <w:r>
+        <w:t xml:space="preserve"> </w:t>
+      </w:r>
+      <w:r>
+        <w:rPr>
+          <w:rFonts w:ascii="Nirmala UI" w:hAnsi="Nirmala UI" w:cs="Nirmala UI"/>
+        </w:rPr>
+        <w:t>বদলে</w:t>
+      </w:r>
+      <w:r>
+        <w:t xml:space="preserve"> Interface </w:t>
+      </w:r>
+      <w:r>
+        <w:rPr>
+          <w:rFonts w:ascii="Nirmala UI" w:hAnsi="Nirmala UI" w:cs="Nirmala UI"/>
+        </w:rPr>
+        <w:t>ব্যবহার</w:t>
+      </w:r>
+      <w:r>
+        <w:t xml:space="preserve"> </w:t>
+      </w:r>
+      <w:r>
+        <w:rPr>
+          <w:rFonts w:ascii="Nirmala UI" w:hAnsi="Nirmala UI" w:cs="Nirmala UI"/>
+        </w:rPr>
+        <w:t>করা।</w:t>
+      </w:r>
+      <w:r>
+        <w:t xml:space="preserve"> </w:t>
+      </w:r>
+    </w:p>
+    <w:p>
+      <w:r>
+        <w:t xml:space="preserve">0:30:04 Type </w:t>
+      </w:r>
+      <w:r>
+        <w:rPr>
+          <w:rFonts w:ascii="Nirmala UI" w:hAnsi="Nirmala UI" w:cs="Nirmala UI"/>
+        </w:rPr>
+        <w:t>এবং</w:t>
+      </w:r>
+      <w:r>
+        <w:t xml:space="preserve"> interface </w:t>
+      </w:r>
+      <w:r>
+        <w:rPr>
+          <w:rFonts w:ascii="Nirmala UI" w:hAnsi="Nirmala UI" w:cs="Nirmala UI"/>
+        </w:rPr>
+        <w:t>এর</w:t>
+      </w:r>
+      <w:r>
+        <w:t xml:space="preserve"> </w:t>
+      </w:r>
+      <w:r>
+        <w:rPr>
+          <w:rFonts w:ascii="Nirmala UI" w:hAnsi="Nirmala UI" w:cs="Nirmala UI"/>
+        </w:rPr>
+        <w:t>ক্ষেত্রে</w:t>
+      </w:r>
+      <w:r>
+        <w:t xml:space="preserve"> semi colon </w:t>
+      </w:r>
+      <w:r>
+        <w:rPr>
+          <w:rFonts w:ascii="Nirmala UI" w:hAnsi="Nirmala UI" w:cs="Nirmala UI"/>
+        </w:rPr>
+        <w:t>নাকি</w:t>
+      </w:r>
+      <w:r>
+        <w:t xml:space="preserve"> comma </w:t>
+      </w:r>
+      <w:r>
+        <w:rPr>
+          <w:rFonts w:ascii="Nirmala UI" w:hAnsi="Nirmala UI" w:cs="Nirmala UI"/>
+        </w:rPr>
+        <w:t>ব্যবহার</w:t>
+      </w:r>
+      <w:r>
+        <w:t xml:space="preserve"> </w:t>
+      </w:r>
+      <w:r>
+        <w:rPr>
+          <w:rFonts w:ascii="Nirmala UI" w:hAnsi="Nirmala UI" w:cs="Nirmala UI"/>
+        </w:rPr>
+        <w:t>করব</w:t>
+      </w:r>
+      <w:r>
+        <w:t xml:space="preserve">? </w:t>
+      </w:r>
+    </w:p>
+    <w:p>
+      <w:r>
+        <w:t xml:space="preserve">0:30:51 </w:t>
+      </w:r>
+      <w:r>
+        <w:rPr>
+          <w:rFonts w:ascii="Nirmala UI" w:hAnsi="Nirmala UI" w:cs="Nirmala UI"/>
+        </w:rPr>
+        <w:t>একটা</w:t>
+      </w:r>
+      <w:r>
+        <w:t xml:space="preserve"> </w:t>
+      </w:r>
+      <w:r>
+        <w:rPr>
+          <w:rFonts w:ascii="Nirmala UI" w:hAnsi="Nirmala UI" w:cs="Nirmala UI"/>
+        </w:rPr>
+        <w:t>ইন্টারেস্টিং</w:t>
+      </w:r>
+      <w:r>
+        <w:t xml:space="preserve"> Nested Type </w:t>
+      </w:r>
+      <w:r>
+        <w:rPr>
+          <w:rFonts w:ascii="Nirmala UI" w:hAnsi="Nirmala UI" w:cs="Nirmala UI"/>
+        </w:rPr>
+        <w:t>এর</w:t>
+      </w:r>
+      <w:r>
+        <w:t xml:space="preserve"> </w:t>
+      </w:r>
+      <w:r>
+        <w:rPr>
+          <w:rFonts w:ascii="Nirmala UI" w:hAnsi="Nirmala UI" w:cs="Nirmala UI"/>
+        </w:rPr>
+        <w:t>এক্সাম্পল।</w:t>
+      </w:r>
+    </w:p>
+    <w:p>
+      <w:r>
+        <w:t xml:space="preserve">0:34:00 TypeScript </w:t>
+      </w:r>
+      <w:r>
+        <w:rPr>
+          <w:rFonts w:ascii="Nirmala UI" w:hAnsi="Nirmala UI" w:cs="Nirmala UI"/>
+        </w:rPr>
+        <w:t>এ</w:t>
+      </w:r>
+      <w:r>
+        <w:t xml:space="preserve"> Tuple </w:t>
+      </w:r>
+      <w:r>
+        <w:rPr>
+          <w:rFonts w:ascii="Nirmala UI" w:hAnsi="Nirmala UI" w:cs="Nirmala UI"/>
+        </w:rPr>
+        <w:t>এর</w:t>
+      </w:r>
+      <w:r>
+        <w:t xml:space="preserve"> </w:t>
+      </w:r>
+      <w:r>
+        <w:rPr>
+          <w:rFonts w:ascii="Nirmala UI" w:hAnsi="Nirmala UI" w:cs="Nirmala UI"/>
+        </w:rPr>
+        <w:t>ব্যবহার।</w:t>
+      </w:r>
+    </w:p>
+    <w:p>
+      <w:r>
+        <w:t xml:space="preserve">0:38:51 Function </w:t>
+      </w:r>
+      <w:r>
+        <w:rPr>
+          <w:rFonts w:ascii="Nirmala UI" w:hAnsi="Nirmala UI" w:cs="Nirmala UI"/>
+        </w:rPr>
+        <w:t>থেকে</w:t>
+      </w:r>
+      <w:r>
+        <w:t xml:space="preserve"> Tuple </w:t>
+      </w:r>
+      <w:r>
+        <w:rPr>
+          <w:rFonts w:ascii="Nirmala UI" w:hAnsi="Nirmala UI" w:cs="Nirmala UI"/>
+        </w:rPr>
+        <w:t>রিটার্ন</w:t>
+      </w:r>
+      <w:r>
+        <w:t xml:space="preserve"> </w:t>
+      </w:r>
+      <w:r>
+        <w:rPr>
+          <w:rFonts w:ascii="Nirmala UI" w:hAnsi="Nirmala UI" w:cs="Nirmala UI"/>
+        </w:rPr>
+        <w:t>করা।</w:t>
+      </w:r>
+    </w:p>
+    <w:p>
+      <w:r>
+        <w:t xml:space="preserve">0:41:58 TypeScript </w:t>
+      </w:r>
+      <w:r>
+        <w:rPr>
+          <w:rFonts w:ascii="Nirmala UI" w:hAnsi="Nirmala UI" w:cs="Nirmala UI"/>
+        </w:rPr>
+        <w:t>এ</w:t>
+      </w:r>
+      <w:r>
+        <w:t xml:space="preserve"> Enum </w:t>
+      </w:r>
+      <w:r>
+        <w:rPr>
+          <w:rFonts w:ascii="Nirmala UI" w:hAnsi="Nirmala UI" w:cs="Nirmala UI"/>
+        </w:rPr>
+        <w:t>এর</w:t>
+      </w:r>
+      <w:r>
+        <w:t xml:space="preserve"> </w:t>
+      </w:r>
+      <w:r>
+        <w:rPr>
+          <w:rFonts w:ascii="Nirmala UI" w:hAnsi="Nirmala UI" w:cs="Nirmala UI"/>
+        </w:rPr>
+        <w:t>ব্যবহার।</w:t>
+      </w:r>
+    </w:p>
+    <w:p>
+      <w:r>
+        <w:t xml:space="preserve">0:46:48 Union Type - TypeScript </w:t>
+      </w:r>
+      <w:r>
+        <w:rPr>
+          <w:rFonts w:ascii="Nirmala UI" w:hAnsi="Nirmala UI" w:cs="Nirmala UI"/>
+        </w:rPr>
+        <w:t>এ</w:t>
+      </w:r>
+      <w:r>
+        <w:t xml:space="preserve"> </w:t>
+      </w:r>
+      <w:r>
+        <w:rPr>
+          <w:rFonts w:ascii="Nirmala UI" w:hAnsi="Nirmala UI" w:cs="Nirmala UI"/>
+        </w:rPr>
+        <w:t>মাল্টিপল</w:t>
+      </w:r>
+      <w:r>
+        <w:t xml:space="preserve"> </w:t>
+      </w:r>
+      <w:r>
+        <w:rPr>
+          <w:rFonts w:ascii="Nirmala UI" w:hAnsi="Nirmala UI" w:cs="Nirmala UI"/>
+        </w:rPr>
+        <w:t>টাইপ</w:t>
+      </w:r>
+      <w:r>
+        <w:t xml:space="preserve"> </w:t>
+      </w:r>
+      <w:r>
+        <w:rPr>
+          <w:rFonts w:ascii="Nirmala UI" w:hAnsi="Nirmala UI" w:cs="Nirmala UI"/>
+        </w:rPr>
+        <w:t>একসেপ্ট</w:t>
+      </w:r>
+      <w:r>
+        <w:t xml:space="preserve"> </w:t>
+      </w:r>
+      <w:r>
+        <w:rPr>
+          <w:rFonts w:ascii="Nirmala UI" w:hAnsi="Nirmala UI" w:cs="Nirmala UI"/>
+        </w:rPr>
+        <w:t>করা।</w:t>
+      </w:r>
+    </w:p>
+    <w:p>
+      <w:r>
+        <w:t xml:space="preserve">0:52:27 Literal Type </w:t>
+      </w:r>
+      <w:r>
+        <w:rPr>
+          <w:rFonts w:ascii="Nirmala UI" w:hAnsi="Nirmala UI" w:cs="Nirmala UI"/>
+        </w:rPr>
+        <w:t>এর</w:t>
+      </w:r>
+      <w:r>
+        <w:t xml:space="preserve"> </w:t>
+      </w:r>
+      <w:r>
+        <w:rPr>
+          <w:rFonts w:ascii="Nirmala UI" w:hAnsi="Nirmala UI" w:cs="Nirmala UI"/>
+        </w:rPr>
+        <w:t>ব্যবহার</w:t>
+      </w:r>
+      <w:r>
+        <w:t xml:space="preserve"> </w:t>
+      </w:r>
+    </w:p>
+    <w:p>
+      <w:r>
+        <w:t xml:space="preserve">0:54:27 TypeScript </w:t>
+      </w:r>
+      <w:r>
+        <w:rPr>
+          <w:rFonts w:ascii="Nirmala UI" w:hAnsi="Nirmala UI" w:cs="Nirmala UI"/>
+        </w:rPr>
+        <w:t>এ</w:t>
+      </w:r>
+      <w:r>
+        <w:t xml:space="preserve"> </w:t>
+      </w:r>
+      <w:r>
+        <w:rPr>
+          <w:rFonts w:ascii="Nirmala UI" w:hAnsi="Nirmala UI" w:cs="Nirmala UI"/>
+        </w:rPr>
+        <w:t>বিল্ট</w:t>
+      </w:r>
+      <w:r>
+        <w:t>-</w:t>
+      </w:r>
+      <w:r>
+        <w:rPr>
+          <w:rFonts w:ascii="Nirmala UI" w:hAnsi="Nirmala UI" w:cs="Nirmala UI"/>
+        </w:rPr>
+        <w:t>ইন</w:t>
+      </w:r>
+      <w:r>
+        <w:t xml:space="preserve"> utility type </w:t>
+      </w:r>
+      <w:r>
+        <w:rPr>
+          <w:rFonts w:ascii="Nirmala UI" w:hAnsi="Nirmala UI" w:cs="Nirmala UI"/>
+        </w:rPr>
+        <w:t>এর</w:t>
+      </w:r>
+      <w:r>
+        <w:t xml:space="preserve"> </w:t>
+      </w:r>
+      <w:r>
+        <w:rPr>
+          <w:rFonts w:ascii="Nirmala UI" w:hAnsi="Nirmala UI" w:cs="Nirmala UI"/>
+        </w:rPr>
+        <w:t>ব্যবহার</w:t>
+      </w:r>
+      <w:r>
+        <w:t xml:space="preserve"> - Omit </w:t>
+      </w:r>
+      <w:r>
+        <w:rPr>
+          <w:rFonts w:ascii="Nirmala UI" w:hAnsi="Nirmala UI" w:cs="Nirmala UI"/>
+        </w:rPr>
+        <w:t>দিয়ে</w:t>
+      </w:r>
+      <w:r>
+        <w:t xml:space="preserve"> </w:t>
+      </w:r>
+      <w:r>
+        <w:rPr>
+          <w:rFonts w:ascii="Nirmala UI" w:hAnsi="Nirmala UI" w:cs="Nirmala UI"/>
+        </w:rPr>
+        <w:t>একটা</w:t>
+      </w:r>
+      <w:r>
+        <w:t xml:space="preserve"> </w:t>
+      </w:r>
+      <w:r>
+        <w:rPr>
+          <w:rFonts w:ascii="Nirmala UI" w:hAnsi="Nirmala UI" w:cs="Nirmala UI"/>
+        </w:rPr>
+        <w:t>দারুণ</w:t>
+      </w:r>
+      <w:r>
+        <w:t xml:space="preserve"> </w:t>
+      </w:r>
+      <w:r>
+        <w:rPr>
+          <w:rFonts w:ascii="Nirmala UI" w:hAnsi="Nirmala UI" w:cs="Nirmala UI"/>
+        </w:rPr>
+        <w:t>এক্সাম্পল।</w:t>
+      </w:r>
+      <w:r>
+        <w:t xml:space="preserve"> </w:t>
+      </w:r>
+    </w:p>
+    <w:p>
+      <w:r>
+        <w:t xml:space="preserve">1:00:06 Type </w:t>
+      </w:r>
+      <w:r>
+        <w:rPr>
+          <w:rFonts w:ascii="Nirmala UI" w:hAnsi="Nirmala UI" w:cs="Nirmala UI"/>
+        </w:rPr>
+        <w:t>এর</w:t>
+      </w:r>
+      <w:r>
+        <w:t xml:space="preserve"> </w:t>
+      </w:r>
+      <w:r>
+        <w:rPr>
+          <w:rFonts w:ascii="Nirmala UI" w:hAnsi="Nirmala UI" w:cs="Nirmala UI"/>
+        </w:rPr>
+        <w:t>সাথে</w:t>
+      </w:r>
+      <w:r>
+        <w:t xml:space="preserve"> Optional Property-</w:t>
+      </w:r>
+      <w:r>
+        <w:rPr>
+          <w:rFonts w:ascii="Nirmala UI" w:hAnsi="Nirmala UI" w:cs="Nirmala UI"/>
+        </w:rPr>
+        <w:t>র</w:t>
+      </w:r>
+      <w:r>
+        <w:t xml:space="preserve"> </w:t>
+      </w:r>
+      <w:r>
+        <w:rPr>
+          <w:rFonts w:ascii="Nirmala UI" w:hAnsi="Nirmala UI" w:cs="Nirmala UI"/>
+        </w:rPr>
+        <w:t>ব্যবহার।</w:t>
+      </w:r>
+    </w:p>
+    <w:p>
+      <w:r>
+        <w:t>1:01:36 Generic (</w:t>
+      </w:r>
+      <w:r>
+        <w:rPr>
+          <w:rFonts w:ascii="Nirmala UI" w:hAnsi="Nirmala UI" w:cs="Nirmala UI"/>
+        </w:rPr>
+        <w:t>জেনেরিক</w:t>
+      </w:r>
+      <w:r>
+        <w:t xml:space="preserve">) </w:t>
+      </w:r>
+      <w:r>
+        <w:rPr>
+          <w:rFonts w:ascii="Nirmala UI" w:hAnsi="Nirmala UI" w:cs="Nirmala UI"/>
+        </w:rPr>
+        <w:t>এর</w:t>
+      </w:r>
+      <w:r>
+        <w:t xml:space="preserve"> </w:t>
+      </w:r>
+      <w:r>
+        <w:rPr>
+          <w:rFonts w:ascii="Nirmala UI" w:hAnsi="Nirmala UI" w:cs="Nirmala UI"/>
+        </w:rPr>
+        <w:t>সাথে</w:t>
+      </w:r>
+      <w:r>
+        <w:t xml:space="preserve"> </w:t>
+      </w:r>
+      <w:r>
+        <w:rPr>
+          <w:rFonts w:ascii="Nirmala UI" w:hAnsi="Nirmala UI" w:cs="Nirmala UI"/>
+        </w:rPr>
+        <w:t>ইন্ট্রোডাকশন।</w:t>
+      </w:r>
+    </w:p>
+    <w:p>
+      <w:r>
+        <w:t xml:space="preserve">1:06:16 API </w:t>
+      </w:r>
+      <w:r>
+        <w:rPr>
+          <w:rFonts w:ascii="Nirmala UI" w:hAnsi="Nirmala UI" w:cs="Nirmala UI"/>
+        </w:rPr>
+        <w:t>এর</w:t>
+      </w:r>
+      <w:r>
+        <w:t xml:space="preserve"> </w:t>
+      </w:r>
+      <w:r>
+        <w:rPr>
+          <w:rFonts w:ascii="Nirmala UI" w:hAnsi="Nirmala UI" w:cs="Nirmala UI"/>
+        </w:rPr>
+        <w:t>সাথে</w:t>
+      </w:r>
+      <w:r>
+        <w:t xml:space="preserve"> generic </w:t>
+      </w:r>
+      <w:r>
+        <w:rPr>
+          <w:rFonts w:ascii="Nirmala UI" w:hAnsi="Nirmala UI" w:cs="Nirmala UI"/>
+        </w:rPr>
+        <w:t>দিয়ে</w:t>
+      </w:r>
+      <w:r>
+        <w:t xml:space="preserve"> </w:t>
+      </w:r>
+      <w:r>
+        <w:rPr>
+          <w:rFonts w:ascii="Nirmala UI" w:hAnsi="Nirmala UI" w:cs="Nirmala UI"/>
+        </w:rPr>
+        <w:t>দারুণ</w:t>
+      </w:r>
+      <w:r>
+        <w:t xml:space="preserve"> </w:t>
+      </w:r>
+      <w:r>
+        <w:rPr>
+          <w:rFonts w:ascii="Nirmala UI" w:hAnsi="Nirmala UI" w:cs="Nirmala UI"/>
+        </w:rPr>
+        <w:t>একটা</w:t>
+      </w:r>
+      <w:r>
+        <w:t xml:space="preserve"> </w:t>
+      </w:r>
+      <w:r>
+        <w:rPr>
+          <w:rFonts w:ascii="Nirmala UI" w:hAnsi="Nirmala UI" w:cs="Nirmala UI"/>
+        </w:rPr>
+        <w:t>এক্সাম্পল।</w:t>
+      </w:r>
+    </w:p>
+    <w:p>
+      <w:r>
+        <w:t xml:space="preserve">1:12:37 Map </w:t>
+      </w:r>
+      <w:r>
+        <w:rPr>
+          <w:rFonts w:ascii="Nirmala UI" w:hAnsi="Nirmala UI" w:cs="Nirmala UI"/>
+        </w:rPr>
+        <w:t>এবং</w:t>
+      </w:r>
+      <w:r>
+        <w:t xml:space="preserve"> Set </w:t>
+      </w:r>
+      <w:r>
+        <w:rPr>
+          <w:rFonts w:ascii="Nirmala UI" w:hAnsi="Nirmala UI" w:cs="Nirmala UI"/>
+        </w:rPr>
+        <w:t>এর</w:t>
+      </w:r>
+      <w:r>
+        <w:t xml:space="preserve"> </w:t>
+      </w:r>
+      <w:r>
+        <w:rPr>
+          <w:rFonts w:ascii="Nirmala UI" w:hAnsi="Nirmala UI" w:cs="Nirmala UI"/>
+        </w:rPr>
+        <w:t>সাথে</w:t>
+      </w:r>
+      <w:r>
+        <w:t xml:space="preserve"> generic type </w:t>
+      </w:r>
+      <w:r>
+        <w:rPr>
+          <w:rFonts w:ascii="Nirmala UI" w:hAnsi="Nirmala UI" w:cs="Nirmala UI"/>
+        </w:rPr>
+        <w:t>এর</w:t>
+      </w:r>
+      <w:r>
+        <w:t xml:space="preserve"> </w:t>
+      </w:r>
+      <w:r>
+        <w:rPr>
+          <w:rFonts w:ascii="Nirmala UI" w:hAnsi="Nirmala UI" w:cs="Nirmala UI"/>
+        </w:rPr>
+        <w:t>ব্যবহার</w:t>
+      </w:r>
+      <w:r>
+        <w:t xml:space="preserve"> </w:t>
+      </w:r>
+    </w:p>
+    <w:p>
+      <w:r>
+        <w:t xml:space="preserve">1:17:47 Map </w:t>
+      </w:r>
+      <w:r>
+        <w:rPr>
+          <w:rFonts w:ascii="Nirmala UI" w:hAnsi="Nirmala UI" w:cs="Nirmala UI"/>
+        </w:rPr>
+        <w:t>দিয়ে</w:t>
+      </w:r>
+      <w:r>
+        <w:t xml:space="preserve"> </w:t>
+      </w:r>
+      <w:r>
+        <w:rPr>
+          <w:rFonts w:ascii="Nirmala UI" w:hAnsi="Nirmala UI" w:cs="Nirmala UI"/>
+        </w:rPr>
+        <w:t>দারুন</w:t>
+      </w:r>
+      <w:r>
+        <w:t xml:space="preserve"> </w:t>
+      </w:r>
+      <w:r>
+        <w:rPr>
+          <w:rFonts w:ascii="Nirmala UI" w:hAnsi="Nirmala UI" w:cs="Nirmala UI"/>
+        </w:rPr>
+        <w:t>একটা</w:t>
+      </w:r>
+      <w:r>
+        <w:t xml:space="preserve"> </w:t>
+      </w:r>
+      <w:r>
+        <w:rPr>
+          <w:rFonts w:ascii="Nirmala UI" w:hAnsi="Nirmala UI" w:cs="Nirmala UI"/>
+        </w:rPr>
+        <w:t>এক্সাম্পল।</w:t>
+      </w:r>
+    </w:p>
+    <w:p>
+      <w:r>
+        <w:t xml:space="preserve">1:21:03 HTML </w:t>
+      </w:r>
+      <w:r>
+        <w:rPr>
+          <w:rFonts w:ascii="Nirmala UI" w:hAnsi="Nirmala UI" w:cs="Nirmala UI"/>
+        </w:rPr>
+        <w:t>এর</w:t>
+      </w:r>
+      <w:r>
+        <w:t xml:space="preserve"> </w:t>
+      </w:r>
+      <w:r>
+        <w:rPr>
+          <w:rFonts w:ascii="Nirmala UI" w:hAnsi="Nirmala UI" w:cs="Nirmala UI"/>
+        </w:rPr>
+        <w:t>সাথে</w:t>
+      </w:r>
+      <w:r>
+        <w:t xml:space="preserve"> </w:t>
+      </w:r>
+      <w:r>
+        <w:rPr>
+          <w:rFonts w:ascii="Nirmala UI" w:hAnsi="Nirmala UI" w:cs="Nirmala UI"/>
+        </w:rPr>
+        <w:t>কিভাবে</w:t>
+      </w:r>
+      <w:r>
+        <w:t xml:space="preserve"> TypeScript </w:t>
+      </w:r>
+      <w:r>
+        <w:rPr>
+          <w:rFonts w:ascii="Nirmala UI" w:hAnsi="Nirmala UI" w:cs="Nirmala UI"/>
+        </w:rPr>
+        <w:t>প্রপারলি</w:t>
+      </w:r>
+      <w:r>
+        <w:t xml:space="preserve"> </w:t>
+      </w:r>
+      <w:r>
+        <w:rPr>
+          <w:rFonts w:ascii="Nirmala UI" w:hAnsi="Nirmala UI" w:cs="Nirmala UI"/>
+        </w:rPr>
+        <w:t>ব্যবহার</w:t>
+      </w:r>
+      <w:r>
+        <w:t xml:space="preserve"> </w:t>
+      </w:r>
+      <w:r>
+        <w:rPr>
+          <w:rFonts w:ascii="Nirmala UI" w:hAnsi="Nirmala UI" w:cs="Nirmala UI"/>
+        </w:rPr>
+        <w:t>করতে</w:t>
+      </w:r>
+      <w:r>
+        <w:t xml:space="preserve"> </w:t>
+      </w:r>
+      <w:r>
+        <w:rPr>
+          <w:rFonts w:ascii="Nirmala UI" w:hAnsi="Nirmala UI" w:cs="Nirmala UI"/>
+        </w:rPr>
+        <w:t>হয়</w:t>
+      </w:r>
+      <w:r>
+        <w:t xml:space="preserve"> </w:t>
+      </w:r>
+      <w:r>
+        <w:rPr>
+          <w:rFonts w:ascii="Nirmala UI" w:hAnsi="Nirmala UI" w:cs="Nirmala UI"/>
+        </w:rPr>
+        <w:t>সেটা</w:t>
+      </w:r>
+      <w:r>
+        <w:t xml:space="preserve"> </w:t>
+      </w:r>
+      <w:r>
+        <w:rPr>
+          <w:rFonts w:ascii="Nirmala UI" w:hAnsi="Nirmala UI" w:cs="Nirmala UI"/>
+        </w:rPr>
+        <w:t>নিয়ে</w:t>
+      </w:r>
+      <w:r>
+        <w:t xml:space="preserve"> </w:t>
+      </w:r>
+      <w:r>
+        <w:rPr>
+          <w:rFonts w:ascii="Nirmala UI" w:hAnsi="Nirmala UI" w:cs="Nirmala UI"/>
+        </w:rPr>
+        <w:t>বিস্তারিত</w:t>
+      </w:r>
+      <w:r>
+        <w:t xml:space="preserve"> </w:t>
+      </w:r>
+    </w:p>
+    <w:p>
+      <w:r>
+        <w:t xml:space="preserve">1:28:08 HTML </w:t>
+      </w:r>
+      <w:r>
+        <w:rPr>
+          <w:rFonts w:ascii="Nirmala UI" w:hAnsi="Nirmala UI" w:cs="Nirmala UI"/>
+        </w:rPr>
+        <w:t>এর</w:t>
+      </w:r>
+      <w:r>
+        <w:t xml:space="preserve"> </w:t>
+      </w:r>
+      <w:r>
+        <w:rPr>
+          <w:rFonts w:ascii="Nirmala UI" w:hAnsi="Nirmala UI" w:cs="Nirmala UI"/>
+        </w:rPr>
+        <w:t>সাথে</w:t>
+      </w:r>
+      <w:r>
+        <w:t xml:space="preserve"> TypeScript </w:t>
+      </w:r>
+      <w:r>
+        <w:rPr>
+          <w:rFonts w:ascii="Nirmala UI" w:hAnsi="Nirmala UI" w:cs="Nirmala UI"/>
+        </w:rPr>
+        <w:t>দিয়ে</w:t>
+      </w:r>
+      <w:r>
+        <w:t xml:space="preserve"> </w:t>
+      </w:r>
+      <w:r>
+        <w:rPr>
+          <w:rFonts w:ascii="Nirmala UI" w:hAnsi="Nirmala UI" w:cs="Nirmala UI"/>
+        </w:rPr>
+        <w:t>একটা</w:t>
+      </w:r>
+      <w:r>
+        <w:t xml:space="preserve"> </w:t>
+      </w:r>
+      <w:r>
+        <w:rPr>
+          <w:rFonts w:ascii="Nirmala UI" w:hAnsi="Nirmala UI" w:cs="Nirmala UI"/>
+        </w:rPr>
+        <w:t>ইন্টারেস্টিং</w:t>
+      </w:r>
+      <w:r>
+        <w:t xml:space="preserve"> </w:t>
+      </w:r>
+      <w:r>
+        <w:rPr>
+          <w:rFonts w:ascii="Nirmala UI" w:hAnsi="Nirmala UI" w:cs="Nirmala UI"/>
+        </w:rPr>
+        <w:t>প্রজেক্ট</w:t>
+      </w:r>
+    </w:p>
+    <w:p>
+      <w:r>
+        <w:t xml:space="preserve">1:40:15 </w:t>
+      </w:r>
+      <w:r>
+        <w:rPr>
+          <w:rFonts w:ascii="Nirmala UI" w:hAnsi="Nirmala UI" w:cs="Nirmala UI"/>
+        </w:rPr>
+        <w:t>মাল্টিপল</w:t>
+      </w:r>
+      <w:r>
+        <w:t xml:space="preserve"> TypeScript </w:t>
+      </w:r>
+      <w:r>
+        <w:rPr>
+          <w:rFonts w:ascii="Nirmala UI" w:hAnsi="Nirmala UI" w:cs="Nirmala UI"/>
+        </w:rPr>
+        <w:t>ফাইল</w:t>
+      </w:r>
+      <w:r>
+        <w:t xml:space="preserve"> bundle </w:t>
+      </w:r>
+      <w:r>
+        <w:rPr>
+          <w:rFonts w:ascii="Nirmala UI" w:hAnsi="Nirmala UI" w:cs="Nirmala UI"/>
+        </w:rPr>
+        <w:t>করে</w:t>
+      </w:r>
+      <w:r>
+        <w:t xml:space="preserve"> </w:t>
+      </w:r>
+      <w:r>
+        <w:rPr>
+          <w:rFonts w:ascii="Nirmala UI" w:hAnsi="Nirmala UI" w:cs="Nirmala UI"/>
+        </w:rPr>
+        <w:t>একটা</w:t>
+      </w:r>
+      <w:r>
+        <w:t xml:space="preserve"> </w:t>
+      </w:r>
+      <w:r>
+        <w:rPr>
+          <w:rFonts w:ascii="Nirmala UI" w:hAnsi="Nirmala UI" w:cs="Nirmala UI"/>
+        </w:rPr>
+        <w:t>সিঙ্গেল</w:t>
+      </w:r>
+      <w:r>
+        <w:t xml:space="preserve"> </w:t>
+      </w:r>
+      <w:r>
+        <w:rPr>
+          <w:rFonts w:ascii="Nirmala UI" w:hAnsi="Nirmala UI" w:cs="Nirmala UI"/>
+        </w:rPr>
+        <w:t>ফাইল</w:t>
+      </w:r>
+      <w:r>
+        <w:t xml:space="preserve"> </w:t>
+      </w:r>
+      <w:r>
+        <w:rPr>
+          <w:rFonts w:ascii="Nirmala UI" w:hAnsi="Nirmala UI" w:cs="Nirmala UI"/>
+        </w:rPr>
+        <w:t>বানানো।</w:t>
+      </w:r>
+    </w:p>
+    <w:p>
+      <w:r>
+        <w:t xml:space="preserve">1:49:57 Tree Shaking </w:t>
+      </w:r>
+      <w:r>
+        <w:rPr>
+          <w:rFonts w:ascii="Nirmala UI" w:hAnsi="Nirmala UI" w:cs="Nirmala UI"/>
+        </w:rPr>
+        <w:t>কি</w:t>
+      </w:r>
+      <w:r>
+        <w:t xml:space="preserve"> </w:t>
+      </w:r>
+      <w:r>
+        <w:rPr>
+          <w:rFonts w:ascii="Nirmala UI" w:hAnsi="Nirmala UI" w:cs="Nirmala UI"/>
+        </w:rPr>
+        <w:t>এবং</w:t>
+      </w:r>
+      <w:r>
+        <w:t xml:space="preserve"> </w:t>
+      </w:r>
+      <w:r>
+        <w:rPr>
+          <w:rFonts w:ascii="Nirmala UI" w:hAnsi="Nirmala UI" w:cs="Nirmala UI"/>
+        </w:rPr>
+        <w:t>কেন</w:t>
+      </w:r>
+      <w:r>
+        <w:t xml:space="preserve"> </w:t>
+      </w:r>
+      <w:r>
+        <w:rPr>
+          <w:rFonts w:ascii="Nirmala UI" w:hAnsi="Nirmala UI" w:cs="Nirmala UI"/>
+        </w:rPr>
+        <w:t>এটা</w:t>
+      </w:r>
+      <w:r>
+        <w:t xml:space="preserve"> </w:t>
+      </w:r>
+      <w:r>
+        <w:rPr>
+          <w:rFonts w:ascii="Nirmala UI" w:hAnsi="Nirmala UI" w:cs="Nirmala UI"/>
+        </w:rPr>
+        <w:t>গুরুত্বপূর্ণ</w:t>
+      </w:r>
+      <w:r>
+        <w:t>?</w:t>
+      </w:r>
+    </w:p>
+    <w:p>
+      <w:r>
+        <w:t xml:space="preserve">1:51:53 Node.js </w:t>
+      </w:r>
+      <w:r>
+        <w:rPr>
+          <w:rFonts w:ascii="Nirmala UI" w:hAnsi="Nirmala UI" w:cs="Nirmala UI"/>
+        </w:rPr>
+        <w:t>এর</w:t>
+      </w:r>
+      <w:r>
+        <w:t xml:space="preserve"> </w:t>
+      </w:r>
+      <w:r>
+        <w:rPr>
+          <w:rFonts w:ascii="Nirmala UI" w:hAnsi="Nirmala UI" w:cs="Nirmala UI"/>
+        </w:rPr>
+        <w:t>সাথে</w:t>
+      </w:r>
+      <w:r>
+        <w:t xml:space="preserve"> TypeScript </w:t>
+      </w:r>
+      <w:r>
+        <w:rPr>
+          <w:rFonts w:ascii="Nirmala UI" w:hAnsi="Nirmala UI" w:cs="Nirmala UI"/>
+        </w:rPr>
+        <w:t>এর</w:t>
+      </w:r>
+      <w:r>
+        <w:t xml:space="preserve"> </w:t>
+      </w:r>
+      <w:r>
+        <w:rPr>
+          <w:rFonts w:ascii="Nirmala UI" w:hAnsi="Nirmala UI" w:cs="Nirmala UI"/>
+        </w:rPr>
+        <w:t>ব্যবহার।</w:t>
+      </w:r>
+    </w:p>
+    <w:p>
+      <w:r>
+        <w:t>1:54:45 TypeScript-</w:t>
+      </w:r>
+      <w:r>
+        <w:rPr>
+          <w:rFonts w:ascii="Nirmala UI" w:hAnsi="Nirmala UI" w:cs="Nirmala UI"/>
+        </w:rPr>
+        <w:t>এ</w:t>
+      </w:r>
+      <w:r>
+        <w:t xml:space="preserve"> object-oriented programming (OOP) </w:t>
+      </w:r>
+      <w:r>
+        <w:rPr>
+          <w:rFonts w:ascii="Nirmala UI" w:hAnsi="Nirmala UI" w:cs="Nirmala UI"/>
+        </w:rPr>
+        <w:t>এবং</w:t>
+      </w:r>
+      <w:r>
+        <w:t xml:space="preserve"> </w:t>
+      </w:r>
+      <w:r>
+        <w:rPr>
+          <w:rFonts w:ascii="Nirmala UI" w:hAnsi="Nirmala UI" w:cs="Nirmala UI"/>
+        </w:rPr>
+        <w:t>সাথে</w:t>
+      </w:r>
+      <w:r>
+        <w:t xml:space="preserve"> </w:t>
+      </w:r>
+      <w:r>
+        <w:rPr>
+          <w:rFonts w:ascii="Nirmala UI" w:hAnsi="Nirmala UI" w:cs="Nirmala UI"/>
+        </w:rPr>
+        <w:t>দারুণ</w:t>
+      </w:r>
+      <w:r>
+        <w:t xml:space="preserve"> </w:t>
+      </w:r>
+      <w:r>
+        <w:rPr>
+          <w:rFonts w:ascii="Nirmala UI" w:hAnsi="Nirmala UI" w:cs="Nirmala UI"/>
+        </w:rPr>
+        <w:t>একটা</w:t>
+      </w:r>
+      <w:r>
+        <w:t xml:space="preserve"> </w:t>
+      </w:r>
+      <w:r>
+        <w:rPr>
+          <w:rFonts w:ascii="Nirmala UI" w:hAnsi="Nirmala UI" w:cs="Nirmala UI"/>
+        </w:rPr>
+        <w:t>প্রজেক্ট।</w:t>
+      </w:r>
+    </w:p>
+    <w:p>
+      <w:r>
+        <w:t xml:space="preserve">2:08:12 Vite </w:t>
+      </w:r>
+      <w:r>
+        <w:rPr>
+          <w:rFonts w:ascii="Nirmala UI" w:hAnsi="Nirmala UI" w:cs="Nirmala UI"/>
+        </w:rPr>
+        <w:t>দিয়ে</w:t>
+      </w:r>
+      <w:r>
+        <w:t xml:space="preserve"> </w:t>
+      </w:r>
+      <w:r>
+        <w:rPr>
+          <w:rFonts w:ascii="Nirmala UI" w:hAnsi="Nirmala UI" w:cs="Nirmala UI"/>
+        </w:rPr>
+        <w:t>মডার্ন</w:t>
+      </w:r>
+      <w:r>
+        <w:t xml:space="preserve"> TypeScript </w:t>
+      </w:r>
+      <w:r>
+        <w:rPr>
+          <w:rFonts w:ascii="Nirmala UI" w:hAnsi="Nirmala UI" w:cs="Nirmala UI"/>
+        </w:rPr>
+        <w:t>প্রজেক্ট</w:t>
+      </w:r>
+      <w:r>
+        <w:t xml:space="preserve"> </w:t>
+      </w:r>
+      <w:r>
+        <w:rPr>
+          <w:rFonts w:ascii="Nirmala UI" w:hAnsi="Nirmala UI" w:cs="Nirmala UI"/>
+        </w:rPr>
+        <w:t>তৈরি</w:t>
+      </w:r>
+      <w:r>
+        <w:t xml:space="preserve"> </w:t>
+      </w:r>
+      <w:r>
+        <w:rPr>
+          <w:rFonts w:ascii="Nirmala UI" w:hAnsi="Nirmala UI" w:cs="Nirmala UI"/>
+        </w:rPr>
+        <w:t>করা</w:t>
+      </w:r>
+      <w:r>
+        <w:t xml:space="preserve">  </w:t>
+      </w:r>
+    </w:p>
+    <w:p>
+      <w:r>
+        <w:t xml:space="preserve">2:15:17 TypeScript </w:t>
+      </w:r>
+      <w:r>
+        <w:rPr>
+          <w:rFonts w:ascii="Nirmala UI" w:hAnsi="Nirmala UI" w:cs="Nirmala UI"/>
+        </w:rPr>
+        <w:t>এ</w:t>
+      </w:r>
+      <w:r>
+        <w:t xml:space="preserve"> Data Validation </w:t>
+      </w:r>
+      <w:r>
+        <w:rPr>
+          <w:rFonts w:ascii="Nirmala UI" w:hAnsi="Nirmala UI" w:cs="Nirmala UI"/>
+        </w:rPr>
+        <w:t>এবং</w:t>
+      </w:r>
+      <w:r>
+        <w:t xml:space="preserve"> Zod Library-</w:t>
+      </w:r>
+      <w:r>
+        <w:rPr>
+          <w:rFonts w:ascii="Nirmala UI" w:hAnsi="Nirmala UI" w:cs="Nirmala UI"/>
+        </w:rPr>
+        <w:t>র</w:t>
+      </w:r>
+      <w:r>
+        <w:t xml:space="preserve"> </w:t>
+      </w:r>
+      <w:r>
+        <w:rPr>
+          <w:rFonts w:ascii="Nirmala UI" w:hAnsi="Nirmala UI" w:cs="Nirmala UI"/>
+        </w:rPr>
+        <w:t>সাথে</w:t>
+      </w:r>
+      <w:r>
+        <w:t xml:space="preserve"> </w:t>
+      </w:r>
+      <w:r>
+        <w:rPr>
+          <w:rFonts w:ascii="Nirmala UI" w:hAnsi="Nirmala UI" w:cs="Nirmala UI"/>
+        </w:rPr>
+        <w:t>পরিচিতি</w:t>
+      </w:r>
+      <w:r>
+        <w:t xml:space="preserve"> </w:t>
+      </w:r>
+      <w:r>
+        <w:rPr>
+          <w:rFonts w:ascii="Nirmala UI" w:hAnsi="Nirmala UI" w:cs="Nirmala UI"/>
+        </w:rPr>
+        <w:t>এবং</w:t>
+      </w:r>
+      <w:r>
+        <w:t xml:space="preserve"> </w:t>
+      </w:r>
+      <w:r>
+        <w:rPr>
+          <w:rFonts w:ascii="Nirmala UI" w:hAnsi="Nirmala UI" w:cs="Nirmala UI"/>
+        </w:rPr>
+        <w:t>দারুণ</w:t>
+      </w:r>
+      <w:r>
+        <w:t xml:space="preserve"> </w:t>
+      </w:r>
+      <w:r>
+        <w:rPr>
+          <w:rFonts w:ascii="Nirmala UI" w:hAnsi="Nirmala UI" w:cs="Nirmala UI"/>
+        </w:rPr>
+        <w:t>একটা</w:t>
+      </w:r>
+      <w:r>
+        <w:t xml:space="preserve"> </w:t>
+      </w:r>
+      <w:r>
+        <w:rPr>
+          <w:rFonts w:ascii="Nirmala UI" w:hAnsi="Nirmala UI" w:cs="Nirmala UI"/>
+        </w:rPr>
+        <w:t>প্রজেক্ট।</w:t>
+      </w:r>
+      <w:r>
+        <w:t xml:space="preserve"> </w:t>
+      </w:r>
+    </w:p>
+    <w:p>
+      <w:r>
+        <w:t xml:space="preserve">2:20:39 Vite </w:t>
+      </w:r>
+      <w:r>
+        <w:rPr>
+          <w:rFonts w:ascii="Nirmala UI" w:hAnsi="Nirmala UI" w:cs="Nirmala UI"/>
+        </w:rPr>
+        <w:t>দিয়ে</w:t>
+      </w:r>
+      <w:r>
+        <w:t xml:space="preserve"> React </w:t>
+      </w:r>
+      <w:r>
+        <w:rPr>
+          <w:rFonts w:ascii="Nirmala UI" w:hAnsi="Nirmala UI" w:cs="Nirmala UI"/>
+        </w:rPr>
+        <w:t>কিংবা</w:t>
+      </w:r>
+      <w:r>
+        <w:t xml:space="preserve"> Vue.js </w:t>
+      </w:r>
+      <w:r>
+        <w:rPr>
+          <w:rFonts w:ascii="Nirmala UI" w:hAnsi="Nirmala UI" w:cs="Nirmala UI"/>
+        </w:rPr>
+        <w:t>প্রজেক্ট</w:t>
+      </w:r>
+      <w:r>
+        <w:t xml:space="preserve"> </w:t>
+      </w:r>
+      <w:r>
+        <w:rPr>
+          <w:rFonts w:ascii="Nirmala UI" w:hAnsi="Nirmala UI" w:cs="Nirmala UI"/>
+        </w:rPr>
+        <w:t>তৈরি</w:t>
+      </w:r>
+      <w:r>
+        <w:t xml:space="preserve"> </w:t>
+      </w:r>
+      <w:r>
+        <w:rPr>
+          <w:rFonts w:ascii="Nirmala UI" w:hAnsi="Nirmala UI" w:cs="Nirmala UI"/>
+        </w:rPr>
+        <w:t>করা।</w:t>
+      </w:r>
+      <w:r>
+        <w:t xml:space="preserve"> </w:t>
+      </w:r>
+    </w:p>
+    <w:p>
+      <w:r>
+        <w:t xml:space="preserve">2:23:32 TSconfig.json </w:t>
+      </w:r>
+      <w:r>
+        <w:rPr>
+          <w:rFonts w:ascii="Nirmala UI" w:hAnsi="Nirmala UI" w:cs="Nirmala UI"/>
+        </w:rPr>
+        <w:t>নিয়ে</w:t>
+      </w:r>
+      <w:r>
+        <w:t xml:space="preserve"> </w:t>
+      </w:r>
+      <w:r>
+        <w:rPr>
+          <w:rFonts w:ascii="Nirmala UI" w:hAnsi="Nirmala UI" w:cs="Nirmala UI"/>
+        </w:rPr>
+        <w:t>জরুরি</w:t>
+      </w:r>
+      <w:r>
+        <w:t xml:space="preserve"> </w:t>
+      </w:r>
+      <w:r>
+        <w:rPr>
+          <w:rFonts w:ascii="Nirmala UI" w:hAnsi="Nirmala UI" w:cs="Nirmala UI"/>
+        </w:rPr>
+        <w:t>কিছু</w:t>
+      </w:r>
+      <w:r>
+        <w:t xml:space="preserve"> </w:t>
+      </w:r>
+      <w:r>
+        <w:rPr>
+          <w:rFonts w:ascii="Nirmala UI" w:hAnsi="Nirmala UI" w:cs="Nirmala UI"/>
+        </w:rPr>
+        <w:t>আলোচনা</w:t>
+      </w:r>
+      <w:r>
+        <w:t xml:space="preserve"> </w:t>
+      </w:r>
+    </w:p>
+    <w:p>
+      <w:r>
+        <w:t xml:space="preserve">2:27:22 Type script </w:t>
+      </w:r>
+      <w:r>
+        <w:rPr>
+          <w:rFonts w:ascii="Nirmala UI" w:hAnsi="Nirmala UI" w:cs="Nirmala UI"/>
+        </w:rPr>
+        <w:t>এর</w:t>
+      </w:r>
+      <w:r>
+        <w:t xml:space="preserve"> </w:t>
+      </w:r>
+      <w:r>
+        <w:rPr>
+          <w:rFonts w:ascii="Nirmala UI" w:hAnsi="Nirmala UI" w:cs="Nirmala UI"/>
+        </w:rPr>
+        <w:t>সাথে</w:t>
+      </w:r>
+      <w:r>
+        <w:t xml:space="preserve"> AI </w:t>
+      </w:r>
+      <w:r>
+        <w:rPr>
+          <w:rFonts w:ascii="Nirmala UI" w:hAnsi="Nirmala UI" w:cs="Nirmala UI"/>
+        </w:rPr>
+        <w:t>এর</w:t>
+      </w:r>
+      <w:r>
+        <w:t xml:space="preserve"> </w:t>
+      </w:r>
+      <w:r>
+        <w:rPr>
+          <w:rFonts w:ascii="Nirmala UI" w:hAnsi="Nirmala UI" w:cs="Nirmala UI"/>
+        </w:rPr>
+        <w:t>ব্যবহার</w:t>
+      </w:r>
+      <w:r>
+        <w:t xml:space="preserve"> </w:t>
+      </w:r>
+      <w:r>
+        <w:rPr>
+          <w:rFonts w:ascii="Nirmala UI" w:hAnsi="Nirmala UI" w:cs="Nirmala UI"/>
+        </w:rPr>
+        <w:t>এবং</w:t>
+      </w:r>
+      <w:r>
+        <w:t xml:space="preserve"> </w:t>
+      </w:r>
+      <w:r>
+        <w:rPr>
+          <w:rFonts w:ascii="Nirmala UI" w:hAnsi="Nirmala UI" w:cs="Nirmala UI"/>
+        </w:rPr>
+        <w:t>একটা</w:t>
+      </w:r>
+      <w:r>
+        <w:t xml:space="preserve"> </w:t>
+      </w:r>
+      <w:r>
+        <w:rPr>
+          <w:rFonts w:ascii="Nirmala UI" w:hAnsi="Nirmala UI" w:cs="Nirmala UI"/>
+        </w:rPr>
+        <w:t>দারুণ</w:t>
+      </w:r>
+      <w:r>
+        <w:t xml:space="preserve"> </w:t>
+      </w:r>
+      <w:r>
+        <w:rPr>
+          <w:rFonts w:ascii="Nirmala UI" w:hAnsi="Nirmala UI" w:cs="Nirmala UI"/>
+        </w:rPr>
+        <w:t>প্রজেক্ট।</w:t>
+      </w:r>
+      <w:r>
+        <w:t xml:space="preserve"> </w:t>
+      </w:r>
+    </w:p>
+    <w:p>
+      <w:r>
+        <w:lastRenderedPageBreak/>
+        <w:t xml:space="preserve">2:33:36 TypeScript </w:t>
+      </w:r>
+      <w:r>
+        <w:rPr>
+          <w:rFonts w:ascii="Nirmala UI" w:hAnsi="Nirmala UI" w:cs="Nirmala UI"/>
+        </w:rPr>
+        <w:t>এর</w:t>
+      </w:r>
+      <w:r>
+        <w:t xml:space="preserve"> </w:t>
+      </w:r>
+      <w:r>
+        <w:rPr>
+          <w:rFonts w:ascii="Nirmala UI" w:hAnsi="Nirmala UI" w:cs="Nirmala UI"/>
+        </w:rPr>
+        <w:t>সাথে</w:t>
+      </w:r>
+      <w:r>
+        <w:t xml:space="preserve"> AI </w:t>
+      </w:r>
+      <w:r>
+        <w:rPr>
+          <w:rFonts w:ascii="Nirmala UI" w:hAnsi="Nirmala UI" w:cs="Nirmala UI"/>
+        </w:rPr>
+        <w:t>ব্যবহার</w:t>
+      </w:r>
+      <w:r>
+        <w:t xml:space="preserve"> </w:t>
+      </w:r>
+      <w:r>
+        <w:rPr>
+          <w:rFonts w:ascii="Nirmala UI" w:hAnsi="Nirmala UI" w:cs="Nirmala UI"/>
+        </w:rPr>
+        <w:t>করে</w:t>
+      </w:r>
+      <w:r>
+        <w:t xml:space="preserve"> </w:t>
+      </w:r>
+      <w:r>
+        <w:rPr>
+          <w:rFonts w:ascii="Nirmala UI" w:hAnsi="Nirmala UI" w:cs="Nirmala UI"/>
+        </w:rPr>
+        <w:t>আরেকটা</w:t>
+      </w:r>
+      <w:r>
+        <w:t xml:space="preserve"> </w:t>
+      </w:r>
+      <w:r>
+        <w:rPr>
+          <w:rFonts w:ascii="Nirmala UI" w:hAnsi="Nirmala UI" w:cs="Nirmala UI"/>
+        </w:rPr>
+        <w:t>প্রজেক্ট।</w:t>
+      </w:r>
+      <w:r>
+        <w:t xml:space="preserve"> </w:t>
+      </w:r>
+    </w:p>
+    <w:p>
+      <w:r>
+        <w:t xml:space="preserve">2:36:57 </w:t>
+      </w:r>
+      <w:r>
+        <w:rPr>
+          <w:rFonts w:ascii="Nirmala UI" w:hAnsi="Nirmala UI" w:cs="Nirmala UI"/>
+        </w:rPr>
+        <w:t>কিভাবে</w:t>
+      </w:r>
+      <w:r>
+        <w:t xml:space="preserve"> </w:t>
+      </w:r>
+      <w:r>
+        <w:rPr>
+          <w:rFonts w:ascii="Nirmala UI" w:hAnsi="Nirmala UI" w:cs="Nirmala UI"/>
+        </w:rPr>
+        <w:t>আপনি</w:t>
+      </w:r>
+      <w:r>
+        <w:t xml:space="preserve"> </w:t>
+      </w:r>
+      <w:r>
+        <w:rPr>
+          <w:rFonts w:ascii="Nirmala UI" w:hAnsi="Nirmala UI" w:cs="Nirmala UI"/>
+        </w:rPr>
+        <w:t>আপনার</w:t>
+      </w:r>
+      <w:r>
+        <w:t xml:space="preserve"> TypeScript-</w:t>
+      </w:r>
+      <w:r>
+        <w:rPr>
+          <w:rFonts w:ascii="Nirmala UI" w:hAnsi="Nirmala UI" w:cs="Nirmala UI"/>
+        </w:rPr>
+        <w:t>এর</w:t>
+      </w:r>
+      <w:r>
+        <w:t xml:space="preserve"> </w:t>
+      </w:r>
+      <w:r>
+        <w:rPr>
+          <w:rFonts w:ascii="Nirmala UI" w:hAnsi="Nirmala UI" w:cs="Nirmala UI"/>
+        </w:rPr>
+        <w:t>স্কিল</w:t>
+      </w:r>
+      <w:r>
+        <w:t xml:space="preserve"> </w:t>
+      </w:r>
+      <w:r>
+        <w:rPr>
+          <w:rFonts w:ascii="Nirmala UI" w:hAnsi="Nirmala UI" w:cs="Nirmala UI"/>
+        </w:rPr>
+        <w:t>আপগ্রেড</w:t>
+      </w:r>
+      <w:r>
+        <w:t xml:space="preserve"> </w:t>
+      </w:r>
+      <w:r>
+        <w:rPr>
+          <w:rFonts w:ascii="Nirmala UI" w:hAnsi="Nirmala UI" w:cs="Nirmala UI"/>
+        </w:rPr>
+        <w:t>করতে</w:t>
+      </w:r>
+      <w:r>
+        <w:t xml:space="preserve"> </w:t>
+      </w:r>
+      <w:r>
+        <w:rPr>
+          <w:rFonts w:ascii="Nirmala UI" w:hAnsi="Nirmala UI" w:cs="Nirmala UI"/>
+        </w:rPr>
+        <w:t>পারবেন</w:t>
+      </w:r>
+      <w:r>
+        <w:t xml:space="preserve">, </w:t>
+      </w:r>
+      <w:r>
+        <w:rPr>
+          <w:rFonts w:ascii="Nirmala UI" w:hAnsi="Nirmala UI" w:cs="Nirmala UI"/>
+        </w:rPr>
+        <w:t>এবং</w:t>
+      </w:r>
+      <w:r>
+        <w:t xml:space="preserve"> </w:t>
+      </w:r>
+      <w:r>
+        <w:rPr>
+          <w:rFonts w:ascii="Nirmala UI" w:hAnsi="Nirmala UI" w:cs="Nirmala UI"/>
+        </w:rPr>
+        <w:t>উপসংহার</w:t>
+      </w:r>
+      <w:bookmarkStart w:id="0" w:name="_GoBack"/>
+      <w:bookmarkEnd w:id="0"/>
+    </w:p>
     <w:sectPr>
       <w:pgSz w:w="12240" w:h="15840"/>
       <w:pgMar w:top="1440" w:right="1440" w:bottom="1440" w:left="1440" w:header="720" w:footer="720" w:gutter="0"/>

</xml_diff>

<commit_message>
generate ts to js by tsc command
</commit_message>
<xml_diff>
--- a/To-Do-TypeScript.docx
+++ b/To-Do-TypeScript.docx
@@ -2284,65 +2284,96 @@
     </w:p>
     <w:p>
       <w:r>
-        <w:t xml:space="preserve">0:54:27 TypeScript </w:t>
-      </w:r>
-      <w:r>
-        <w:rPr>
-          <w:rFonts w:ascii="Nirmala UI" w:hAnsi="Nirmala UI" w:cs="Nirmala UI"/>
+        <w:t xml:space="preserve">0:54:27 </w:t>
+      </w:r>
+      <w:r>
+        <w:rPr>
+          <w:highlight w:val="yellow"/>
+        </w:rPr>
+        <w:t xml:space="preserve">TypeScript </w:t>
+      </w:r>
+      <w:r>
+        <w:rPr>
+          <w:rFonts w:ascii="Nirmala UI" w:hAnsi="Nirmala UI" w:cs="Nirmala UI"/>
+          <w:highlight w:val="yellow"/>
         </w:rPr>
         <w:t>এ</w:t>
       </w:r>
       <w:r>
-        <w:t xml:space="preserve"> </w:t>
-      </w:r>
-      <w:r>
-        <w:rPr>
-          <w:rFonts w:ascii="Nirmala UI" w:hAnsi="Nirmala UI" w:cs="Nirmala UI"/>
+        <w:rPr>
+          <w:highlight w:val="yellow"/>
+        </w:rPr>
+        <w:t xml:space="preserve"> </w:t>
+      </w:r>
+      <w:r>
+        <w:rPr>
+          <w:rFonts w:ascii="Nirmala UI" w:hAnsi="Nirmala UI" w:cs="Nirmala UI"/>
+          <w:highlight w:val="yellow"/>
         </w:rPr>
         <w:t>বিল্ট</w:t>
       </w:r>
       <w:r>
+        <w:rPr>
+          <w:highlight w:val="yellow"/>
+        </w:rPr>
         <w:t>-</w:t>
       </w:r>
       <w:r>
         <w:rPr>
           <w:rFonts w:ascii="Nirmala UI" w:hAnsi="Nirmala UI" w:cs="Nirmala UI"/>
+          <w:highlight w:val="yellow"/>
         </w:rPr>
         <w:t>ইন</w:t>
       </w:r>
       <w:r>
+        <w:rPr>
+          <w:highlight w:val="yellow"/>
+        </w:rPr>
         <w:t xml:space="preserve"> utility type </w:t>
       </w:r>
       <w:r>
         <w:rPr>
           <w:rFonts w:ascii="Nirmala UI" w:hAnsi="Nirmala UI" w:cs="Nirmala UI"/>
+          <w:highlight w:val="yellow"/>
         </w:rPr>
         <w:t>এর</w:t>
       </w:r>
       <w:r>
-        <w:t xml:space="preserve"> </w:t>
-      </w:r>
-      <w:r>
-        <w:rPr>
-          <w:rFonts w:ascii="Nirmala UI" w:hAnsi="Nirmala UI" w:cs="Nirmala UI"/>
+        <w:rPr>
+          <w:highlight w:val="yellow"/>
+        </w:rPr>
+        <w:t xml:space="preserve"> </w:t>
+      </w:r>
+      <w:r>
+        <w:rPr>
+          <w:rFonts w:ascii="Nirmala UI" w:hAnsi="Nirmala UI" w:cs="Nirmala UI"/>
+          <w:highlight w:val="yellow"/>
         </w:rPr>
         <w:t>ব্যবহার</w:t>
       </w:r>
       <w:r>
+        <w:rPr>
+          <w:highlight w:val="yellow"/>
+        </w:rPr>
         <w:t xml:space="preserve"> - Omit </w:t>
       </w:r>
       <w:r>
         <w:rPr>
           <w:rFonts w:ascii="Nirmala UI" w:hAnsi="Nirmala UI" w:cs="Nirmala UI"/>
+          <w:highlight w:val="yellow"/>
         </w:rPr>
         <w:t>দিয়ে</w:t>
       </w:r>
       <w:r>
-        <w:t xml:space="preserve"> </w:t>
-      </w:r>
-      <w:r>
-        <w:rPr>
-          <w:rFonts w:ascii="Nirmala UI" w:hAnsi="Nirmala UI" w:cs="Nirmala UI"/>
+        <w:rPr>
+          <w:highlight w:val="yellow"/>
+        </w:rPr>
+        <w:t xml:space="preserve"> </w:t>
+      </w:r>
+      <w:r>
+        <w:rPr>
+          <w:rFonts w:ascii="Nirmala UI" w:hAnsi="Nirmala UI" w:cs="Nirmala UI"/>
+          <w:highlight w:val="yellow"/>
         </w:rPr>
         <w:t>একটা</w:t>
       </w:r>
@@ -2403,8 +2434,10 @@
         <w:rPr>
           <w:rFonts w:ascii="Nirmala UI" w:hAnsi="Nirmala UI" w:cs="Nirmala UI"/>
         </w:rPr>
-        <w:t>ব্যবহার।</w:t>
-      </w:r>
+        <w:t>ব্</w:t>
+      </w:r>
+      <w:bookmarkStart w:id="0" w:name="_GoBack"/>
+      <w:bookmarkEnd w:id="0"/>
     </w:p>
     <w:p>
       <w:r>
@@ -3403,8 +3436,6 @@
         </w:rPr>
         <w:t>উপসংহার</w:t>
       </w:r>
-      <w:bookmarkStart w:id="0" w:name="_GoBack"/>
-      <w:bookmarkEnd w:id="0"/>
     </w:p>
     <w:sectPr>
       <w:pgSz w:w="12240" w:h="15840"/>

</xml_diff>

<commit_message>
multiple file TSC with directory
</commit_message>
<xml_diff>
--- a/To-Do-TypeScript.docx
+++ b/To-Do-TypeScript.docx
@@ -1671,74 +1671,118 @@
     </w:p>
     <w:p>
       <w:r>
-        <w:t xml:space="preserve">0:10:14 TypeScript </w:t>
-      </w:r>
-      <w:r>
-        <w:rPr>
-          <w:rFonts w:ascii="Nirmala UI" w:hAnsi="Nirmala UI" w:cs="Nirmala UI"/>
-        </w:rPr>
-        <w:t>থেকে</w:t>
-      </w:r>
-      <w:r>
+        <w:t xml:space="preserve">0:10:14 </w:t>
+      </w:r>
+      <w:r>
+        <w:rPr>
+          <w:highlight w:val="yellow"/>
+        </w:rPr>
+        <w:t xml:space="preserve">TypeScript </w:t>
+      </w:r>
+      <w:r>
+        <w:rPr>
+          <w:rFonts w:ascii="Nirmala UI" w:hAnsi="Nirmala UI" w:cs="Nirmala UI"/>
+          <w:highlight w:val="yellow"/>
+        </w:rPr>
+        <w:t>থে</w:t>
+      </w:r>
+      <w:bookmarkStart w:id="0" w:name="_GoBack"/>
+      <w:bookmarkEnd w:id="0"/>
+      <w:r>
+        <w:rPr>
+          <w:rFonts w:ascii="Nirmala UI" w:hAnsi="Nirmala UI" w:cs="Nirmala UI"/>
+          <w:highlight w:val="yellow"/>
+        </w:rPr>
+        <w:t>কে</w:t>
+      </w:r>
+      <w:r>
+        <w:rPr>
+          <w:highlight w:val="yellow"/>
+        </w:rPr>
         <w:t xml:space="preserve"> JavaScript </w:t>
       </w:r>
       <w:r>
         <w:rPr>
           <w:rFonts w:ascii="Nirmala UI" w:hAnsi="Nirmala UI" w:cs="Nirmala UI"/>
+          <w:highlight w:val="yellow"/>
         </w:rPr>
         <w:t>এর</w:t>
       </w:r>
       <w:r>
-        <w:t xml:space="preserve"> </w:t>
-      </w:r>
-      <w:r>
-        <w:rPr>
-          <w:rFonts w:ascii="Nirmala UI" w:hAnsi="Nirmala UI" w:cs="Nirmala UI"/>
+        <w:rPr>
+          <w:highlight w:val="yellow"/>
+        </w:rPr>
+        <w:t xml:space="preserve"> </w:t>
+      </w:r>
+      <w:r>
+        <w:rPr>
+          <w:rFonts w:ascii="Nirmala UI" w:hAnsi="Nirmala UI" w:cs="Nirmala UI"/>
+          <w:highlight w:val="yellow"/>
         </w:rPr>
         <w:t>কনভার্সন</w:t>
       </w:r>
       <w:r>
+        <w:rPr>
+          <w:highlight w:val="yellow"/>
+        </w:rPr>
         <w:t xml:space="preserve"> (Transpiling) </w:t>
       </w:r>
       <w:r>
         <w:rPr>
           <w:rFonts w:ascii="Nirmala UI" w:hAnsi="Nirmala UI" w:cs="Nirmala UI"/>
+          <w:highlight w:val="yellow"/>
         </w:rPr>
         <w:t>এবং</w:t>
       </w:r>
       <w:r>
+        <w:rPr>
+          <w:highlight w:val="yellow"/>
+        </w:rPr>
         <w:t xml:space="preserve"> HTML-</w:t>
       </w:r>
       <w:r>
         <w:rPr>
           <w:rFonts w:ascii="Nirmala UI" w:hAnsi="Nirmala UI" w:cs="Nirmala UI"/>
+          <w:highlight w:val="yellow"/>
         </w:rPr>
         <w:t>এর</w:t>
       </w:r>
       <w:r>
-        <w:t xml:space="preserve"> </w:t>
-      </w:r>
-      <w:r>
-        <w:rPr>
-          <w:rFonts w:ascii="Nirmala UI" w:hAnsi="Nirmala UI" w:cs="Nirmala UI"/>
+        <w:rPr>
+          <w:highlight w:val="yellow"/>
+        </w:rPr>
+        <w:t xml:space="preserve"> </w:t>
+      </w:r>
+      <w:r>
+        <w:rPr>
+          <w:rFonts w:ascii="Nirmala UI" w:hAnsi="Nirmala UI" w:cs="Nirmala UI"/>
+          <w:highlight w:val="yellow"/>
         </w:rPr>
         <w:t>মধ্যে</w:t>
       </w:r>
       <w:r>
+        <w:rPr>
+          <w:highlight w:val="yellow"/>
+        </w:rPr>
         <w:t xml:space="preserve"> TypeScript-</w:t>
       </w:r>
       <w:r>
         <w:rPr>
           <w:rFonts w:ascii="Nirmala UI" w:hAnsi="Nirmala UI" w:cs="Nirmala UI"/>
+          <w:highlight w:val="yellow"/>
         </w:rPr>
         <w:t>এর</w:t>
       </w:r>
       <w:r>
-        <w:t xml:space="preserve"> </w:t>
-      </w:r>
-      <w:r>
-        <w:rPr>
-          <w:rFonts w:ascii="Nirmala UI" w:hAnsi="Nirmala UI" w:cs="Nirmala UI"/>
+        <w:rPr>
+          <w:highlight w:val="yellow"/>
+        </w:rPr>
+        <w:t xml:space="preserve"> </w:t>
+      </w:r>
+      <w:r>
+        <w:rPr>
+          <w:rFonts w:ascii="Nirmala UI" w:hAnsi="Nirmala UI" w:cs="Nirmala UI"/>
+          <w:highlight w:val="yellow"/>
         </w:rPr>
         <w:t>ব্যবহার।</w:t>
       </w:r>
@@ -2436,8 +2480,6 @@
         </w:rPr>
         <w:t>ব্</w:t>
       </w:r>
-      <w:bookmarkStart w:id="0" w:name="_GoBack"/>
-      <w:bookmarkEnd w:id="0"/>
     </w:p>
     <w:p>
       <w:r>

</xml_diff>

<commit_message>
array, nested type, interface
</commit_message>
<xml_diff>
--- a/To-Do-TypeScript.docx
+++ b/To-Do-TypeScript.docx
@@ -1455,7 +1455,11 @@
     <w:p/>
     <w:p/>
     <w:p/>
-    <w:p/>
+    <w:p>
+      <w:r>
+        <w:t>//Special Course</w:t>
+      </w:r>
+    </w:p>
     <w:p>
       <w:r>
         <w:t xml:space="preserve">0:00:00 </w:t>
@@ -1684,474 +1688,589 @@
           <w:rFonts w:ascii="Nirmala UI" w:hAnsi="Nirmala UI" w:cs="Nirmala UI"/>
           <w:highlight w:val="yellow"/>
         </w:rPr>
-        <w:t>থে</w:t>
+        <w:t>থেকে</w:t>
+      </w:r>
+      <w:r>
+        <w:rPr>
+          <w:highlight w:val="yellow"/>
+        </w:rPr>
+        <w:t xml:space="preserve"> JavaScript </w:t>
+      </w:r>
+      <w:r>
+        <w:rPr>
+          <w:rFonts w:ascii="Nirmala UI" w:hAnsi="Nirmala UI" w:cs="Nirmala UI"/>
+          <w:highlight w:val="yellow"/>
+        </w:rPr>
+        <w:t>এর</w:t>
+      </w:r>
+      <w:r>
+        <w:rPr>
+          <w:highlight w:val="yellow"/>
+        </w:rPr>
+        <w:t xml:space="preserve"> </w:t>
+      </w:r>
+      <w:r>
+        <w:rPr>
+          <w:rFonts w:ascii="Nirmala UI" w:hAnsi="Nirmala UI" w:cs="Nirmala UI"/>
+          <w:highlight w:val="yellow"/>
+        </w:rPr>
+        <w:t>কনভার্সন</w:t>
+      </w:r>
+      <w:r>
+        <w:rPr>
+          <w:highlight w:val="yellow"/>
+        </w:rPr>
+        <w:t xml:space="preserve"> (Transpiling) </w:t>
+      </w:r>
+      <w:r>
+        <w:rPr>
+          <w:rFonts w:ascii="Nirmala UI" w:hAnsi="Nirmala UI" w:cs="Nirmala UI"/>
+          <w:highlight w:val="yellow"/>
+        </w:rPr>
+        <w:t>এবং</w:t>
+      </w:r>
+      <w:r>
+        <w:rPr>
+          <w:highlight w:val="yellow"/>
+        </w:rPr>
+        <w:t xml:space="preserve"> HTML-</w:t>
+      </w:r>
+      <w:r>
+        <w:rPr>
+          <w:rFonts w:ascii="Nirmala UI" w:hAnsi="Nirmala UI" w:cs="Nirmala UI"/>
+          <w:highlight w:val="yellow"/>
+        </w:rPr>
+        <w:t>এর</w:t>
+      </w:r>
+      <w:r>
+        <w:rPr>
+          <w:highlight w:val="yellow"/>
+        </w:rPr>
+        <w:t xml:space="preserve"> </w:t>
+      </w:r>
+      <w:r>
+        <w:rPr>
+          <w:rFonts w:ascii="Nirmala UI" w:hAnsi="Nirmala UI" w:cs="Nirmala UI"/>
+          <w:highlight w:val="yellow"/>
+        </w:rPr>
+        <w:t>মধ্যে</w:t>
+      </w:r>
+      <w:r>
+        <w:rPr>
+          <w:highlight w:val="yellow"/>
+        </w:rPr>
+        <w:t xml:space="preserve"> TypeScript-</w:t>
+      </w:r>
+      <w:r>
+        <w:rPr>
+          <w:rFonts w:ascii="Nirmala UI" w:hAnsi="Nirmala UI" w:cs="Nirmala UI"/>
+          <w:highlight w:val="yellow"/>
+        </w:rPr>
+        <w:t>এর</w:t>
+      </w:r>
+      <w:r>
+        <w:rPr>
+          <w:highlight w:val="yellow"/>
+        </w:rPr>
+        <w:t xml:space="preserve"> </w:t>
+      </w:r>
+      <w:r>
+        <w:rPr>
+          <w:rFonts w:ascii="Nirmala UI" w:hAnsi="Nirmala UI" w:cs="Nirmala UI"/>
+          <w:highlight w:val="yellow"/>
+        </w:rPr>
+        <w:t>ব্যবহার।</w:t>
+      </w:r>
+      <w:r>
+        <w:t xml:space="preserve"> </w:t>
+      </w:r>
+    </w:p>
+    <w:p>
+      <w:r>
+        <w:t>0:13:</w:t>
+      </w:r>
+      <w:r>
+        <w:rPr>
+          <w:highlight w:val="yellow"/>
+        </w:rPr>
+        <w:t xml:space="preserve">03 Watch Mode </w:t>
+      </w:r>
+      <w:r>
+        <w:rPr>
+          <w:rFonts w:ascii="Nirmala UI" w:hAnsi="Nirmala UI" w:cs="Nirmala UI"/>
+          <w:highlight w:val="yellow"/>
+        </w:rPr>
+        <w:t>ব্যবহার</w:t>
+      </w:r>
+      <w:r>
+        <w:rPr>
+          <w:highlight w:val="yellow"/>
+        </w:rPr>
+        <w:t xml:space="preserve"> </w:t>
+      </w:r>
+      <w:r>
+        <w:rPr>
+          <w:rFonts w:ascii="Nirmala UI" w:hAnsi="Nirmala UI" w:cs="Nirmala UI"/>
+          <w:highlight w:val="yellow"/>
+        </w:rPr>
+        <w:t>করে</w:t>
+      </w:r>
+      <w:r>
+        <w:t xml:space="preserve"> </w:t>
+      </w:r>
+      <w:r>
+        <w:rPr>
+          <w:rFonts w:ascii="Nirmala UI" w:hAnsi="Nirmala UI" w:cs="Nirmala UI"/>
+        </w:rPr>
+        <w:t>অটোমেটিক্যালি</w:t>
+      </w:r>
+      <w:r>
+        <w:t xml:space="preserve"> </w:t>
+      </w:r>
+      <w:r>
+        <w:rPr>
+          <w:rFonts w:ascii="Nirmala UI" w:hAnsi="Nirmala UI" w:cs="Nirmala UI"/>
+        </w:rPr>
+        <w:t>ট্রান্সপাইল</w:t>
+      </w:r>
+      <w:r>
+        <w:t xml:space="preserve"> </w:t>
+      </w:r>
+      <w:r>
+        <w:rPr>
+          <w:rFonts w:ascii="Nirmala UI" w:hAnsi="Nirmala UI" w:cs="Nirmala UI"/>
+        </w:rPr>
+        <w:t>করা।</w:t>
+      </w:r>
+    </w:p>
+    <w:p>
+      <w:r>
+        <w:t xml:space="preserve">0:13:48 </w:t>
+      </w:r>
+      <w:r>
+        <w:rPr>
+          <w:highlight w:val="yellow"/>
+        </w:rPr>
+        <w:t xml:space="preserve">Multiple file </w:t>
+      </w:r>
+      <w:r>
+        <w:rPr>
+          <w:rFonts w:ascii="Nirmala UI" w:hAnsi="Nirmala UI" w:cs="Nirmala UI"/>
+          <w:highlight w:val="yellow"/>
+        </w:rPr>
+        <w:t>একসাথে</w:t>
+      </w:r>
+      <w:r>
+        <w:rPr>
+          <w:highlight w:val="yellow"/>
+        </w:rPr>
+        <w:t xml:space="preserve"> Transpile</w:t>
+      </w:r>
+      <w:r>
+        <w:t xml:space="preserve"> </w:t>
+      </w:r>
+      <w:r>
+        <w:rPr>
+          <w:rFonts w:ascii="Nirmala UI" w:hAnsi="Nirmala UI" w:cs="Nirmala UI"/>
+        </w:rPr>
+        <w:t>করা।</w:t>
+      </w:r>
+      <w:r>
+        <w:t xml:space="preserve"> </w:t>
+      </w:r>
+    </w:p>
+    <w:p>
+      <w:r>
+        <w:t>0:15:</w:t>
+      </w:r>
+      <w:r>
+        <w:rPr>
+          <w:highlight w:val="yellow"/>
+        </w:rPr>
+        <w:t>47 Different</w:t>
+      </w:r>
+      <w:r>
+        <w:t xml:space="preserve"> directory </w:t>
+      </w:r>
+      <w:r>
+        <w:rPr>
+          <w:rFonts w:ascii="Nirmala UI" w:hAnsi="Nirmala UI" w:cs="Nirmala UI"/>
+        </w:rPr>
+        <w:t>তে</w:t>
+      </w:r>
+      <w:r>
+        <w:t xml:space="preserve"> multiple file </w:t>
+      </w:r>
+      <w:r>
+        <w:rPr>
+          <w:rFonts w:ascii="Nirmala UI" w:hAnsi="Nirmala UI" w:cs="Nirmala UI"/>
+        </w:rPr>
+        <w:t>একসাথে</w:t>
+      </w:r>
+      <w:r>
+        <w:t xml:space="preserve"> transpile </w:t>
+      </w:r>
+      <w:r>
+        <w:rPr>
+          <w:rFonts w:ascii="Nirmala UI" w:hAnsi="Nirmala UI" w:cs="Nirmala UI"/>
+        </w:rPr>
+        <w:t>করা।</w:t>
+      </w:r>
+      <w:r>
+        <w:t xml:space="preserve"> </w:t>
+      </w:r>
+    </w:p>
+    <w:p>
+      <w:r>
+        <w:t>0:17:36 TypeScript-</w:t>
+      </w:r>
+      <w:r>
+        <w:rPr>
+          <w:rFonts w:ascii="Nirmala UI" w:hAnsi="Nirmala UI" w:cs="Nirmala UI"/>
+        </w:rPr>
+        <w:t>এর</w:t>
+      </w:r>
+      <w:r>
+        <w:t xml:space="preserve"> </w:t>
+      </w:r>
+      <w:r>
+        <w:rPr>
+          <w:rFonts w:ascii="Nirmala UI" w:hAnsi="Nirmala UI" w:cs="Nirmala UI"/>
+        </w:rPr>
+        <w:t>বিভিন্ন</w:t>
+      </w:r>
+      <w:r>
+        <w:t xml:space="preserve"> Type </w:t>
+      </w:r>
+      <w:r>
+        <w:rPr>
+          <w:rFonts w:ascii="Nirmala UI" w:hAnsi="Nirmala UI" w:cs="Nirmala UI"/>
+        </w:rPr>
+        <w:t>নিয়ে</w:t>
+      </w:r>
+      <w:r>
+        <w:t xml:space="preserve"> </w:t>
+      </w:r>
+      <w:r>
+        <w:rPr>
+          <w:rFonts w:ascii="Nirmala UI" w:hAnsi="Nirmala UI" w:cs="Nirmala UI"/>
+        </w:rPr>
+        <w:t>বিস্তারিত</w:t>
+      </w:r>
+      <w:r>
+        <w:t xml:space="preserve"> </w:t>
+      </w:r>
+      <w:r>
+        <w:rPr>
+          <w:rFonts w:ascii="Nirmala UI" w:hAnsi="Nirmala UI" w:cs="Nirmala UI"/>
+        </w:rPr>
+        <w:t>আলোচনা।</w:t>
+      </w:r>
+      <w:r>
+        <w:t xml:space="preserve"> </w:t>
+      </w:r>
+    </w:p>
+    <w:p>
+      <w:r>
+        <w:lastRenderedPageBreak/>
+        <w:t xml:space="preserve">0:22:49 </w:t>
+      </w:r>
+      <w:r>
+        <w:rPr>
+          <w:rFonts w:ascii="Nirmala UI" w:hAnsi="Nirmala UI" w:cs="Nirmala UI"/>
+          <w:highlight w:val="yellow"/>
+        </w:rPr>
+        <w:t>ভ্যারিয়েবল</w:t>
+      </w:r>
+      <w:r>
+        <w:rPr>
+          <w:highlight w:val="yellow"/>
+        </w:rPr>
+        <w:t xml:space="preserve"> </w:t>
+      </w:r>
+      <w:r>
+        <w:rPr>
+          <w:rFonts w:ascii="Nirmala UI" w:hAnsi="Nirmala UI" w:cs="Nirmala UI"/>
+          <w:highlight w:val="yellow"/>
+        </w:rPr>
+        <w:t>এর</w:t>
+      </w:r>
+      <w:r>
+        <w:rPr>
+          <w:highlight w:val="yellow"/>
+        </w:rPr>
+        <w:t xml:space="preserve"> </w:t>
+      </w:r>
+      <w:r>
+        <w:rPr>
+          <w:rFonts w:ascii="Nirmala UI" w:hAnsi="Nirmala UI" w:cs="Nirmala UI"/>
+          <w:highlight w:val="yellow"/>
+        </w:rPr>
+        <w:t>নাম</w:t>
+      </w:r>
+      <w:r>
+        <w:rPr>
+          <w:highlight w:val="yellow"/>
+        </w:rPr>
+        <w:t xml:space="preserve"> </w:t>
+      </w:r>
+      <w:r>
+        <w:rPr>
+          <w:rFonts w:ascii="Nirmala UI" w:hAnsi="Nirmala UI" w:cs="Nirmala UI"/>
+          <w:highlight w:val="yellow"/>
+        </w:rPr>
+        <w:t>নিয়ে</w:t>
+      </w:r>
+      <w:r>
+        <w:rPr>
+          <w:highlight w:val="yellow"/>
+        </w:rPr>
+        <w:t xml:space="preserve"> </w:t>
+      </w:r>
+      <w:r>
+        <w:rPr>
+          <w:rFonts w:ascii="Nirmala UI" w:hAnsi="Nirmala UI" w:cs="Nirmala UI"/>
+          <w:highlight w:val="yellow"/>
+        </w:rPr>
+        <w:t>গন্ডগোল।</w:t>
+      </w:r>
+      <w:r>
+        <w:t xml:space="preserve"> </w:t>
+      </w:r>
+    </w:p>
+    <w:p>
+      <w:r>
+        <w:t xml:space="preserve">0:25:13 </w:t>
+      </w:r>
+      <w:r>
+        <w:rPr>
+          <w:highlight w:val="yellow"/>
+        </w:rPr>
+        <w:t xml:space="preserve">Array </w:t>
+      </w:r>
+      <w:r>
+        <w:rPr>
+          <w:rFonts w:ascii="Nirmala UI" w:hAnsi="Nirmala UI" w:cs="Nirmala UI"/>
+          <w:highlight w:val="yellow"/>
+        </w:rPr>
+        <w:t>এবং</w:t>
+      </w:r>
+      <w:r>
+        <w:rPr>
+          <w:highlight w:val="yellow"/>
+        </w:rPr>
+        <w:t xml:space="preserve"> JSON object </w:t>
+      </w:r>
+      <w:r>
+        <w:rPr>
+          <w:rFonts w:ascii="Nirmala UI" w:hAnsi="Nirmala UI" w:cs="Nirmala UI"/>
+          <w:highlight w:val="yellow"/>
+        </w:rPr>
+        <w:t>নিয়ে</w:t>
+      </w:r>
+      <w:r>
+        <w:rPr>
+          <w:highlight w:val="yellow"/>
+        </w:rPr>
+        <w:t xml:space="preserve"> </w:t>
+      </w:r>
+      <w:r>
+        <w:rPr>
+          <w:rFonts w:ascii="Nirmala UI" w:hAnsi="Nirmala UI" w:cs="Nirmala UI"/>
+          <w:highlight w:val="yellow"/>
+        </w:rPr>
+        <w:t>কাজ</w:t>
+      </w:r>
+      <w:r>
+        <w:t xml:space="preserve"> </w:t>
+      </w:r>
+      <w:r>
+        <w:rPr>
+          <w:rFonts w:ascii="Nirmala UI" w:hAnsi="Nirmala UI" w:cs="Nirmala UI"/>
+        </w:rPr>
+        <w:t>করা।</w:t>
+      </w:r>
+    </w:p>
+    <w:p>
+      <w:r>
+        <w:t>0:29:</w:t>
+      </w:r>
+      <w:r>
+        <w:rPr>
+          <w:highlight w:val="yellow"/>
+        </w:rPr>
+        <w:t xml:space="preserve">42 Type </w:t>
+      </w:r>
+      <w:r>
+        <w:rPr>
+          <w:rFonts w:ascii="Nirmala UI" w:hAnsi="Nirmala UI" w:cs="Nirmala UI"/>
+          <w:highlight w:val="yellow"/>
+        </w:rPr>
+        <w:t>এর</w:t>
+      </w:r>
+      <w:r>
+        <w:rPr>
+          <w:highlight w:val="yellow"/>
+        </w:rPr>
+        <w:t xml:space="preserve"> </w:t>
+      </w:r>
+      <w:r>
+        <w:rPr>
+          <w:rFonts w:ascii="Nirmala UI" w:hAnsi="Nirmala UI" w:cs="Nirmala UI"/>
+          <w:highlight w:val="yellow"/>
+        </w:rPr>
+        <w:t>বদলে</w:t>
+      </w:r>
+      <w:r>
+        <w:rPr>
+          <w:highlight w:val="yellow"/>
+        </w:rPr>
+        <w:t xml:space="preserve"> Interface </w:t>
+      </w:r>
+      <w:r>
+        <w:rPr>
+          <w:rFonts w:ascii="Nirmala UI" w:hAnsi="Nirmala UI" w:cs="Nirmala UI"/>
+          <w:highlight w:val="yellow"/>
+        </w:rPr>
+        <w:t>ব্যবহার</w:t>
+      </w:r>
+      <w:r>
+        <w:t xml:space="preserve"> </w:t>
+      </w:r>
+      <w:r>
+        <w:rPr>
+          <w:rFonts w:ascii="Nirmala UI" w:hAnsi="Nirmala UI" w:cs="Nirmala UI"/>
+        </w:rPr>
+        <w:t>করা।</w:t>
+      </w:r>
+      <w:r>
+        <w:t xml:space="preserve"> </w:t>
+      </w:r>
+    </w:p>
+    <w:p>
+      <w:r>
+        <w:t>0:30:</w:t>
+      </w:r>
+      <w:r>
+        <w:rPr>
+          <w:highlight w:val="yellow"/>
+        </w:rPr>
+        <w:t xml:space="preserve">04 Type </w:t>
+      </w:r>
+      <w:r>
+        <w:rPr>
+          <w:rFonts w:ascii="Nirmala UI" w:hAnsi="Nirmala UI" w:cs="Nirmala UI"/>
+          <w:highlight w:val="yellow"/>
+        </w:rPr>
+        <w:t>এবং</w:t>
+      </w:r>
+      <w:r>
+        <w:rPr>
+          <w:highlight w:val="yellow"/>
+        </w:rPr>
+        <w:t xml:space="preserve"> interface </w:t>
+      </w:r>
+      <w:r>
+        <w:rPr>
+          <w:rFonts w:ascii="Nirmala UI" w:hAnsi="Nirmala UI" w:cs="Nirmala UI"/>
+          <w:highlight w:val="yellow"/>
+        </w:rPr>
+        <w:t>এর</w:t>
+      </w:r>
+      <w:r>
+        <w:rPr>
+          <w:highlight w:val="yellow"/>
+        </w:rPr>
+        <w:t xml:space="preserve"> </w:t>
+      </w:r>
+      <w:r>
+        <w:rPr>
+          <w:rFonts w:ascii="Nirmala UI" w:hAnsi="Nirmala UI" w:cs="Nirmala UI"/>
+          <w:highlight w:val="yellow"/>
+        </w:rPr>
+        <w:t>ক্ষেত্রে</w:t>
+      </w:r>
+      <w:r>
+        <w:rPr>
+          <w:highlight w:val="yellow"/>
+        </w:rPr>
+        <w:t xml:space="preserve"> semi colon </w:t>
+      </w:r>
+      <w:r>
+        <w:rPr>
+          <w:rFonts w:ascii="Nirmala UI" w:hAnsi="Nirmala UI" w:cs="Nirmala UI"/>
+          <w:highlight w:val="yellow"/>
+        </w:rPr>
+        <w:t>নাকি</w:t>
+      </w:r>
+      <w:r>
+        <w:t xml:space="preserve"> comma </w:t>
+      </w:r>
+      <w:r>
+        <w:rPr>
+          <w:rFonts w:ascii="Nirmala UI" w:hAnsi="Nirmala UI" w:cs="Nirmala UI"/>
+        </w:rPr>
+        <w:t>ব্যবহার</w:t>
+      </w:r>
+      <w:r>
+        <w:t xml:space="preserve"> </w:t>
+      </w:r>
+      <w:r>
+        <w:rPr>
+          <w:rFonts w:ascii="Nirmala UI" w:hAnsi="Nirmala UI" w:cs="Nirmala UI"/>
+        </w:rPr>
+        <w:t>করব</w:t>
+      </w:r>
+      <w:r>
+        <w:t xml:space="preserve">? </w:t>
+      </w:r>
+    </w:p>
+    <w:p>
+      <w:r>
+        <w:t>0:30:</w:t>
+      </w:r>
+      <w:r>
+        <w:rPr>
+          <w:highlight w:val="yellow"/>
+        </w:rPr>
+        <w:t xml:space="preserve">51 </w:t>
+      </w:r>
+      <w:r>
+        <w:rPr>
+          <w:rFonts w:ascii="Nirmala UI" w:hAnsi="Nirmala UI" w:cs="Nirmala UI"/>
+          <w:highlight w:val="yellow"/>
+        </w:rPr>
+        <w:t>একটা</w:t>
+      </w:r>
+      <w:r>
+        <w:rPr>
+          <w:highlight w:val="yellow"/>
+        </w:rPr>
+        <w:t xml:space="preserve"> </w:t>
+      </w:r>
+      <w:r>
+        <w:rPr>
+          <w:rFonts w:ascii="Nirmala UI" w:hAnsi="Nirmala UI" w:cs="Nirmala UI"/>
+          <w:highlight w:val="yellow"/>
+        </w:rPr>
+        <w:t>ইন্টারেস্টিং</w:t>
+      </w:r>
+      <w:r>
+        <w:rPr>
+          <w:highlight w:val="yellow"/>
+        </w:rPr>
+        <w:t xml:space="preserve"> Nested</w:t>
       </w:r>
       <w:bookmarkStart w:id="0" w:name="_GoBack"/>
       <w:bookmarkEnd w:id="0"/>
       <w:r>
         <w:rPr>
-          <w:rFonts w:ascii="Nirmala UI" w:hAnsi="Nirmala UI" w:cs="Nirmala UI"/>
-          <w:highlight w:val="yellow"/>
-        </w:rPr>
-        <w:t>কে</w:t>
-      </w:r>
-      <w:r>
-        <w:rPr>
-          <w:highlight w:val="yellow"/>
-        </w:rPr>
-        <w:t xml:space="preserve"> JavaScript </w:t>
-      </w:r>
-      <w:r>
-        <w:rPr>
-          <w:rFonts w:ascii="Nirmala UI" w:hAnsi="Nirmala UI" w:cs="Nirmala UI"/>
-          <w:highlight w:val="yellow"/>
-        </w:rPr>
-        <w:t>এর</w:t>
-      </w:r>
-      <w:r>
-        <w:rPr>
-          <w:highlight w:val="yellow"/>
-        </w:rPr>
-        <w:t xml:space="preserve"> </w:t>
-      </w:r>
-      <w:r>
-        <w:rPr>
-          <w:rFonts w:ascii="Nirmala UI" w:hAnsi="Nirmala UI" w:cs="Nirmala UI"/>
-          <w:highlight w:val="yellow"/>
-        </w:rPr>
-        <w:t>কনভার্সন</w:t>
-      </w:r>
-      <w:r>
-        <w:rPr>
-          <w:highlight w:val="yellow"/>
-        </w:rPr>
-        <w:t xml:space="preserve"> (Transpiling) </w:t>
-      </w:r>
-      <w:r>
-        <w:rPr>
-          <w:rFonts w:ascii="Nirmala UI" w:hAnsi="Nirmala UI" w:cs="Nirmala UI"/>
-          <w:highlight w:val="yellow"/>
-        </w:rPr>
-        <w:t>এবং</w:t>
-      </w:r>
-      <w:r>
-        <w:rPr>
-          <w:highlight w:val="yellow"/>
-        </w:rPr>
-        <w:t xml:space="preserve"> HTML-</w:t>
-      </w:r>
-      <w:r>
-        <w:rPr>
-          <w:rFonts w:ascii="Nirmala UI" w:hAnsi="Nirmala UI" w:cs="Nirmala UI"/>
-          <w:highlight w:val="yellow"/>
-        </w:rPr>
-        <w:t>এর</w:t>
-      </w:r>
-      <w:r>
-        <w:rPr>
-          <w:highlight w:val="yellow"/>
-        </w:rPr>
-        <w:t xml:space="preserve"> </w:t>
-      </w:r>
-      <w:r>
-        <w:rPr>
-          <w:rFonts w:ascii="Nirmala UI" w:hAnsi="Nirmala UI" w:cs="Nirmala UI"/>
-          <w:highlight w:val="yellow"/>
-        </w:rPr>
-        <w:t>মধ্যে</w:t>
-      </w:r>
-      <w:r>
-        <w:rPr>
-          <w:highlight w:val="yellow"/>
-        </w:rPr>
-        <w:t xml:space="preserve"> TypeScript-</w:t>
-      </w:r>
-      <w:r>
-        <w:rPr>
-          <w:rFonts w:ascii="Nirmala UI" w:hAnsi="Nirmala UI" w:cs="Nirmala UI"/>
-          <w:highlight w:val="yellow"/>
-        </w:rPr>
-        <w:t>এর</w:t>
-      </w:r>
-      <w:r>
-        <w:rPr>
-          <w:highlight w:val="yellow"/>
-        </w:rPr>
-        <w:t xml:space="preserve"> </w:t>
-      </w:r>
-      <w:r>
-        <w:rPr>
-          <w:rFonts w:ascii="Nirmala UI" w:hAnsi="Nirmala UI" w:cs="Nirmala UI"/>
-          <w:highlight w:val="yellow"/>
-        </w:rPr>
-        <w:t>ব্যবহার।</w:t>
-      </w:r>
-      <w:r>
-        <w:t xml:space="preserve"> </w:t>
-      </w:r>
-    </w:p>
-    <w:p>
-      <w:r>
-        <w:t xml:space="preserve">0:13:03 Watch Mode </w:t>
-      </w:r>
-      <w:r>
-        <w:rPr>
-          <w:rFonts w:ascii="Nirmala UI" w:hAnsi="Nirmala UI" w:cs="Nirmala UI"/>
-        </w:rPr>
-        <w:t>ব্যবহার</w:t>
-      </w:r>
-      <w:r>
-        <w:t xml:space="preserve"> </w:t>
-      </w:r>
-      <w:r>
-        <w:rPr>
-          <w:rFonts w:ascii="Nirmala UI" w:hAnsi="Nirmala UI" w:cs="Nirmala UI"/>
-        </w:rPr>
-        <w:t>করে</w:t>
-      </w:r>
-      <w:r>
-        <w:t xml:space="preserve"> </w:t>
-      </w:r>
-      <w:r>
-        <w:rPr>
-          <w:rFonts w:ascii="Nirmala UI" w:hAnsi="Nirmala UI" w:cs="Nirmala UI"/>
-        </w:rPr>
-        <w:t>অটোমেটিক্যালি</w:t>
-      </w:r>
-      <w:r>
-        <w:t xml:space="preserve"> </w:t>
-      </w:r>
-      <w:r>
-        <w:rPr>
-          <w:rFonts w:ascii="Nirmala UI" w:hAnsi="Nirmala UI" w:cs="Nirmala UI"/>
-        </w:rPr>
-        <w:t>ট্রান্সপাইল</w:t>
-      </w:r>
-      <w:r>
-        <w:t xml:space="preserve"> </w:t>
-      </w:r>
-      <w:r>
-        <w:rPr>
-          <w:rFonts w:ascii="Nirmala UI" w:hAnsi="Nirmala UI" w:cs="Nirmala UI"/>
-        </w:rPr>
-        <w:t>করা।</w:t>
-      </w:r>
-    </w:p>
-    <w:p>
-      <w:r>
-        <w:t xml:space="preserve">0:13:48 Multiple file </w:t>
-      </w:r>
-      <w:r>
-        <w:rPr>
-          <w:rFonts w:ascii="Nirmala UI" w:hAnsi="Nirmala UI" w:cs="Nirmala UI"/>
-        </w:rPr>
-        <w:t>একসাথে</w:t>
-      </w:r>
-      <w:r>
-        <w:t xml:space="preserve"> Transpile </w:t>
-      </w:r>
-      <w:r>
-        <w:rPr>
-          <w:rFonts w:ascii="Nirmala UI" w:hAnsi="Nirmala UI" w:cs="Nirmala UI"/>
-        </w:rPr>
-        <w:t>করা।</w:t>
-      </w:r>
-      <w:r>
-        <w:t xml:space="preserve"> </w:t>
-      </w:r>
-    </w:p>
-    <w:p>
-      <w:r>
-        <w:t xml:space="preserve">0:15:47 Different directory </w:t>
-      </w:r>
-      <w:r>
-        <w:rPr>
-          <w:rFonts w:ascii="Nirmala UI" w:hAnsi="Nirmala UI" w:cs="Nirmala UI"/>
-        </w:rPr>
-        <w:t>তে</w:t>
-      </w:r>
-      <w:r>
-        <w:t xml:space="preserve"> multiple file </w:t>
-      </w:r>
-      <w:r>
-        <w:rPr>
-          <w:rFonts w:ascii="Nirmala UI" w:hAnsi="Nirmala UI" w:cs="Nirmala UI"/>
-        </w:rPr>
-        <w:t>একসাথে</w:t>
-      </w:r>
-      <w:r>
-        <w:t xml:space="preserve"> transpile </w:t>
-      </w:r>
-      <w:r>
-        <w:rPr>
-          <w:rFonts w:ascii="Nirmala UI" w:hAnsi="Nirmala UI" w:cs="Nirmala UI"/>
-        </w:rPr>
-        <w:t>করা।</w:t>
-      </w:r>
-      <w:r>
-        <w:t xml:space="preserve"> </w:t>
-      </w:r>
-    </w:p>
-    <w:p>
-      <w:r>
-        <w:t>0:17:36 TypeScript-</w:t>
-      </w:r>
-      <w:r>
-        <w:rPr>
-          <w:rFonts w:ascii="Nirmala UI" w:hAnsi="Nirmala UI" w:cs="Nirmala UI"/>
-        </w:rPr>
-        <w:t>এর</w:t>
-      </w:r>
-      <w:r>
-        <w:t xml:space="preserve"> </w:t>
-      </w:r>
-      <w:r>
-        <w:rPr>
-          <w:rFonts w:ascii="Nirmala UI" w:hAnsi="Nirmala UI" w:cs="Nirmala UI"/>
-        </w:rPr>
-        <w:t>বিভিন্ন</w:t>
-      </w:r>
-      <w:r>
-        <w:t xml:space="preserve"> Type </w:t>
-      </w:r>
-      <w:r>
-        <w:rPr>
-          <w:rFonts w:ascii="Nirmala UI" w:hAnsi="Nirmala UI" w:cs="Nirmala UI"/>
-        </w:rPr>
-        <w:t>নিয়ে</w:t>
-      </w:r>
-      <w:r>
-        <w:t xml:space="preserve"> </w:t>
-      </w:r>
-      <w:r>
-        <w:rPr>
-          <w:rFonts w:ascii="Nirmala UI" w:hAnsi="Nirmala UI" w:cs="Nirmala UI"/>
-        </w:rPr>
-        <w:t>বিস্তারিত</w:t>
-      </w:r>
-      <w:r>
-        <w:t xml:space="preserve"> </w:t>
-      </w:r>
-      <w:r>
-        <w:rPr>
-          <w:rFonts w:ascii="Nirmala UI" w:hAnsi="Nirmala UI" w:cs="Nirmala UI"/>
-        </w:rPr>
-        <w:t>আলোচনা।</w:t>
-      </w:r>
-      <w:r>
-        <w:t xml:space="preserve"> </w:t>
-      </w:r>
-    </w:p>
-    <w:p>
-      <w:r>
-        <w:lastRenderedPageBreak/>
-        <w:t xml:space="preserve">0:22:49 </w:t>
-      </w:r>
-      <w:r>
-        <w:rPr>
-          <w:rFonts w:ascii="Nirmala UI" w:hAnsi="Nirmala UI" w:cs="Nirmala UI"/>
-        </w:rPr>
-        <w:t>ভ্যারিয়েবল</w:t>
-      </w:r>
-      <w:r>
-        <w:t xml:space="preserve"> </w:t>
-      </w:r>
-      <w:r>
-        <w:rPr>
-          <w:rFonts w:ascii="Nirmala UI" w:hAnsi="Nirmala UI" w:cs="Nirmala UI"/>
-        </w:rPr>
-        <w:t>এর</w:t>
-      </w:r>
-      <w:r>
-        <w:t xml:space="preserve"> </w:t>
-      </w:r>
-      <w:r>
-        <w:rPr>
-          <w:rFonts w:ascii="Nirmala UI" w:hAnsi="Nirmala UI" w:cs="Nirmala UI"/>
-        </w:rPr>
-        <w:t>নাম</w:t>
-      </w:r>
-      <w:r>
-        <w:t xml:space="preserve"> </w:t>
-      </w:r>
-      <w:r>
-        <w:rPr>
-          <w:rFonts w:ascii="Nirmala UI" w:hAnsi="Nirmala UI" w:cs="Nirmala UI"/>
-        </w:rPr>
-        <w:t>নিয়ে</w:t>
-      </w:r>
-      <w:r>
-        <w:t xml:space="preserve"> </w:t>
-      </w:r>
-      <w:r>
-        <w:rPr>
-          <w:rFonts w:ascii="Nirmala UI" w:hAnsi="Nirmala UI" w:cs="Nirmala UI"/>
-        </w:rPr>
-        <w:t>গন্ডগোল।</w:t>
-      </w:r>
-      <w:r>
-        <w:t xml:space="preserve"> </w:t>
-      </w:r>
-    </w:p>
-    <w:p>
-      <w:r>
-        <w:t xml:space="preserve">0:25:13 Array </w:t>
-      </w:r>
-      <w:r>
-        <w:rPr>
-          <w:rFonts w:ascii="Nirmala UI" w:hAnsi="Nirmala UI" w:cs="Nirmala UI"/>
-        </w:rPr>
-        <w:t>এবং</w:t>
-      </w:r>
-      <w:r>
-        <w:t xml:space="preserve"> JSON object </w:t>
-      </w:r>
-      <w:r>
-        <w:rPr>
-          <w:rFonts w:ascii="Nirmala UI" w:hAnsi="Nirmala UI" w:cs="Nirmala UI"/>
-        </w:rPr>
-        <w:t>নিয়ে</w:t>
-      </w:r>
-      <w:r>
-        <w:t xml:space="preserve"> </w:t>
-      </w:r>
-      <w:r>
-        <w:rPr>
-          <w:rFonts w:ascii="Nirmala UI" w:hAnsi="Nirmala UI" w:cs="Nirmala UI"/>
-        </w:rPr>
-        <w:t>কাজ</w:t>
-      </w:r>
-      <w:r>
-        <w:t xml:space="preserve"> </w:t>
-      </w:r>
-      <w:r>
-        <w:rPr>
-          <w:rFonts w:ascii="Nirmala UI" w:hAnsi="Nirmala UI" w:cs="Nirmala UI"/>
-        </w:rPr>
-        <w:t>করা।</w:t>
-      </w:r>
-    </w:p>
-    <w:p>
-      <w:r>
-        <w:t xml:space="preserve">0:29:42 Type </w:t>
-      </w:r>
-      <w:r>
-        <w:rPr>
-          <w:rFonts w:ascii="Nirmala UI" w:hAnsi="Nirmala UI" w:cs="Nirmala UI"/>
-        </w:rPr>
-        <w:t>এর</w:t>
-      </w:r>
-      <w:r>
-        <w:t xml:space="preserve"> </w:t>
-      </w:r>
-      <w:r>
-        <w:rPr>
-          <w:rFonts w:ascii="Nirmala UI" w:hAnsi="Nirmala UI" w:cs="Nirmala UI"/>
-        </w:rPr>
-        <w:t>বদলে</w:t>
-      </w:r>
-      <w:r>
-        <w:t xml:space="preserve"> Interface </w:t>
-      </w:r>
-      <w:r>
-        <w:rPr>
-          <w:rFonts w:ascii="Nirmala UI" w:hAnsi="Nirmala UI" w:cs="Nirmala UI"/>
-        </w:rPr>
-        <w:t>ব্যবহার</w:t>
-      </w:r>
-      <w:r>
-        <w:t xml:space="preserve"> </w:t>
-      </w:r>
-      <w:r>
-        <w:rPr>
-          <w:rFonts w:ascii="Nirmala UI" w:hAnsi="Nirmala UI" w:cs="Nirmala UI"/>
-        </w:rPr>
-        <w:t>করা।</w:t>
-      </w:r>
-      <w:r>
-        <w:t xml:space="preserve"> </w:t>
-      </w:r>
-    </w:p>
-    <w:p>
-      <w:r>
-        <w:t xml:space="preserve">0:30:04 Type </w:t>
-      </w:r>
-      <w:r>
-        <w:rPr>
-          <w:rFonts w:ascii="Nirmala UI" w:hAnsi="Nirmala UI" w:cs="Nirmala UI"/>
-        </w:rPr>
-        <w:t>এবং</w:t>
-      </w:r>
-      <w:r>
-        <w:t xml:space="preserve"> interface </w:t>
-      </w:r>
-      <w:r>
-        <w:rPr>
-          <w:rFonts w:ascii="Nirmala UI" w:hAnsi="Nirmala UI" w:cs="Nirmala UI"/>
-        </w:rPr>
-        <w:t>এর</w:t>
-      </w:r>
-      <w:r>
-        <w:t xml:space="preserve"> </w:t>
-      </w:r>
-      <w:r>
-        <w:rPr>
-          <w:rFonts w:ascii="Nirmala UI" w:hAnsi="Nirmala UI" w:cs="Nirmala UI"/>
-        </w:rPr>
-        <w:t>ক্ষেত্রে</w:t>
-      </w:r>
-      <w:r>
-        <w:t xml:space="preserve"> semi colon </w:t>
-      </w:r>
-      <w:r>
-        <w:rPr>
-          <w:rFonts w:ascii="Nirmala UI" w:hAnsi="Nirmala UI" w:cs="Nirmala UI"/>
-        </w:rPr>
-        <w:t>নাকি</w:t>
-      </w:r>
-      <w:r>
-        <w:t xml:space="preserve"> comma </w:t>
-      </w:r>
-      <w:r>
-        <w:rPr>
-          <w:rFonts w:ascii="Nirmala UI" w:hAnsi="Nirmala UI" w:cs="Nirmala UI"/>
-        </w:rPr>
-        <w:t>ব্যবহার</w:t>
-      </w:r>
-      <w:r>
-        <w:t xml:space="preserve"> </w:t>
-      </w:r>
-      <w:r>
-        <w:rPr>
-          <w:rFonts w:ascii="Nirmala UI" w:hAnsi="Nirmala UI" w:cs="Nirmala UI"/>
-        </w:rPr>
-        <w:t>করব</w:t>
-      </w:r>
-      <w:r>
-        <w:t xml:space="preserve">? </w:t>
-      </w:r>
-    </w:p>
-    <w:p>
-      <w:r>
-        <w:t xml:space="preserve">0:30:51 </w:t>
-      </w:r>
-      <w:r>
-        <w:rPr>
-          <w:rFonts w:ascii="Nirmala UI" w:hAnsi="Nirmala UI" w:cs="Nirmala UI"/>
-        </w:rPr>
-        <w:t>একটা</w:t>
-      </w:r>
-      <w:r>
-        <w:t xml:space="preserve"> </w:t>
-      </w:r>
-      <w:r>
-        <w:rPr>
-          <w:rFonts w:ascii="Nirmala UI" w:hAnsi="Nirmala UI" w:cs="Nirmala UI"/>
-        </w:rPr>
-        <w:t>ইন্টারেস্টিং</w:t>
-      </w:r>
-      <w:r>
-        <w:t xml:space="preserve"> Nested Type </w:t>
+          <w:highlight w:val="yellow"/>
+        </w:rPr>
+        <w:t xml:space="preserve"> Type</w:t>
+      </w:r>
+      <w:r>
+        <w:t xml:space="preserve"> </w:t>
       </w:r>
       <w:r>
         <w:rPr>

</xml_diff>